<commit_message>
docs: rewrite API documentation to match professional format from community app team
</commit_message>
<xml_diff>
--- a/SEVA_PASS_INTEGRATION_API.docx
+++ b/SEVA_PASS_INTEGRATION_API.docx
@@ -7,104 +7,319 @@
         <w:jc w:val="center"/>
         <w:rPr>
           <w:b/>
-          <w:sz w:val="40"/>
+          <w:sz w:val="44"/>
         </w:rPr>
       </w:pPr>
       <w:r>
         <w:rPr>
           <w:b/>
-          <w:sz w:val="40"/>
+          <w:sz w:val="44"/>
         </w:rPr>
-        <w:t>ISKCON Seva Pass - Integration API Documentation</w:t>
+        <w:t>Hare Krishna Vizag</w:t>
+      </w:r>
+    </w:p>
+    <w:p>
+      <w:pPr>
+        <w:jc w:val="center"/>
+        <w:rPr>
+          <w:b/>
+          <w:sz w:val="32"/>
+        </w:rPr>
+      </w:pPr>
+      <w:r>
+        <w:rPr>
+          <w:b/>
+          <w:sz w:val="32"/>
+        </w:rPr>
+        <w:t>Seva Pass API Documentation</w:t>
+      </w:r>
+    </w:p>
+    <w:p>
+      <w:pPr>
+        <w:jc w:val="center"/>
+      </w:pPr>
+      <w:r>
+        <w:t>Generate QR Pass</w:t>
+      </w:r>
+    </w:p>
+    <w:p>
+      <w:pPr>
+        <w:jc w:val="center"/>
+      </w:pPr>
+    </w:p>
+    <w:p>
+      <w:pPr>
+        <w:rPr>
+          <w:b/>
+        </w:rPr>
+      </w:pPr>
+      <w:r>
+        <w:rPr>
+          <w:b/>
+        </w:rPr>
+        <w:t>Base URL</w:t>
       </w:r>
     </w:p>
     <w:p>
       <w:pPr>
         <w:rPr>
-          <w:sz w:val="20"/>
+          <w:rFonts w:ascii="Consolas" w:hAnsi="Consolas"/>
         </w:rPr>
       </w:pPr>
       <w:r>
         <w:rPr>
-          <w:sz w:val="20"/>
+          <w:rFonts w:ascii="Consolas" w:hAnsi="Consolas"/>
         </w:rPr>
-        <w:t>For: Mobile App / Community App Team (harekrishnavizag.co.in)</w:t>
+        <w:t>https://iskcon-seva-pass-backend-production.up.railway.app</w:t>
       </w:r>
     </w:p>
     <w:p>
       <w:pPr>
         <w:rPr>
-          <w:sz w:val="20"/>
-        </w:rPr>
-      </w:pPr>
-      <w:r>
-        <w:rPr>
-          <w:sz w:val="20"/>
-        </w:rPr>
-        <w:t>Base URL: https://iskcon-seva-pass-backend-production.up.railway.app</w:t>
-      </w:r>
-    </w:p>
-    <w:p>
-      <w:pPr>
-        <w:rPr>
-          <w:sz w:val="20"/>
-        </w:rPr>
-      </w:pPr>
-      <w:r>
-        <w:rPr>
-          <w:sz w:val="20"/>
-        </w:rPr>
-        <w:t>Last Updated: August 2026</w:t>
-      </w:r>
-    </w:p>
-    <w:p>
-      <w:pPr>
-        <w:rPr>
-          <w:sz w:val="20"/>
+          <w:rFonts w:ascii="Calibri" w:hAnsi="Calibri" w:cs="Calibri"/>
         </w:rPr>
       </w:pPr>
     </w:p>
     <w:p>
       <w:pPr>
         <w:rPr>
+          <w:rFonts w:ascii="Calibri" w:hAnsi="Calibri" w:cs="Calibri"/>
           <w:b/>
-          <w:sz w:val="28"/>
         </w:rPr>
       </w:pPr>
       <w:r>
         <w:rPr>
+          <w:rFonts w:ascii="Calibri" w:hAnsi="Calibri" w:cs="Calibri"/>
           <w:b/>
-          <w:sz w:val="28"/>
         </w:rPr>
-        <w:t>Authentication</w:t>
+        <w:t>General Notes</w:t>
       </w:r>
     </w:p>
     <w:p>
       <w:pPr>
         <w:rPr>
-          <w:sz w:val="20"/>
+          <w:rFonts w:ascii="Calibri" w:hAnsi="Calibri" w:cs="Calibri"/>
         </w:rPr>
       </w:pPr>
       <w:r>
         <w:rPr>
-          <w:sz w:val="20"/>
+          <w:rFonts w:ascii="Calibri" w:hAnsi="Calibri" w:cs="Calibri"/>
         </w:rPr>
-        <w:t>All requests require an API key sent via header:</w:t>
+        <w:t>All endpoints are prefixed with: api/integration/</w:t>
       </w:r>
     </w:p>
     <w:p>
       <w:pPr>
         <w:rPr>
-          <w:rFonts w:ascii="Consolas" w:hAnsi="Consolas"/>
-          <w:sz w:val="20"/>
+          <w:rFonts w:ascii="Calibri" w:hAnsi="Calibri" w:cs="Calibri"/>
         </w:rPr>
       </w:pPr>
       <w:r>
         <w:rPr>
-          <w:rFonts w:ascii="Consolas" w:hAnsi="Consolas"/>
-          <w:sz w:val="20"/>
+          <w:rFonts w:ascii="Calibri" w:hAnsi="Calibri" w:cs="Calibri"/>
         </w:rPr>
-        <w:t>X-API-Key: &lt;your-api-key&gt;</w:t>
+        <w:t>The Generate QR endpoint uses the HTTP POST method.</w:t>
+      </w:r>
+    </w:p>
+    <w:p>
+      <w:pPr>
+        <w:rPr>
+          <w:rFonts w:ascii="Calibri" w:hAnsi="Calibri" w:cs="Calibri"/>
+        </w:rPr>
+      </w:pPr>
+      <w:r>
+        <w:rPr>
+          <w:rFonts w:ascii="Calibri" w:hAnsi="Calibri" w:cs="Calibri"/>
+        </w:rPr>
+        <w:t>Request bodies are sent as JSON.</w:t>
+      </w:r>
+    </w:p>
+    <w:p>
+      <w:pPr>
+        <w:rPr>
+          <w:rFonts w:ascii="Calibri" w:hAnsi="Calibri" w:cs="Calibri"/>
+        </w:rPr>
+      </w:pPr>
+      <w:r>
+        <w:rPr>
+          <w:rFonts w:ascii="Calibri" w:hAnsi="Calibri" w:cs="Calibri"/>
+        </w:rPr>
+        <w:t>If a volunteer does not already exist by mobile number, the system automatically creates one.</w:t>
+      </w:r>
+    </w:p>
+    <w:p>
+      <w:pPr>
+        <w:rPr>
+          <w:rFonts w:ascii="Calibri" w:hAnsi="Calibri" w:cs="Calibri"/>
+        </w:rPr>
+      </w:pPr>
+      <w:r>
+        <w:rPr>
+          <w:rFonts w:ascii="Calibri" w:hAnsi="Calibri" w:cs="Calibri"/>
+        </w:rPr>
+        <w:t>No authentication is required for the Generate QR endpoint.</w:t>
+      </w:r>
+    </w:p>
+    <w:p>
+      <w:pPr>
+        <w:rPr>
+          <w:rFonts w:ascii="Calibri" w:hAnsi="Calibri" w:cs="Calibri"/>
+        </w:rPr>
+      </w:pPr>
+    </w:p>
+    <w:p>
+      <w:pPr>
+        <w:rPr>
+          <w:rFonts w:ascii="Calibri" w:hAnsi="Calibri" w:cs="Calibri"/>
+          <w:b/>
+        </w:rPr>
+      </w:pPr>
+      <w:r>
+        <w:rPr>
+          <w:rFonts w:ascii="Calibri" w:hAnsi="Calibri" w:cs="Calibri"/>
+          <w:b/>
+        </w:rPr>
+        <w:t>Standard Response Format</w:t>
+      </w:r>
+    </w:p>
+    <w:p>
+      <w:pPr>
+        <w:rPr>
+          <w:rFonts w:ascii="Calibri" w:hAnsi="Calibri" w:cs="Calibri"/>
+        </w:rPr>
+      </w:pPr>
+      <w:r>
+        <w:rPr>
+          <w:rFonts w:ascii="Calibri" w:hAnsi="Calibri" w:cs="Calibri"/>
+        </w:rPr>
+        <w:t>Every endpoint in this API returns a response in the following shape:</w:t>
+      </w:r>
+    </w:p>
+    <w:p>
+      <w:pPr>
+        <w:rPr>
+          <w:rFonts w:ascii="Calibri" w:hAnsi="Calibri" w:cs="Calibri"/>
+        </w:rPr>
+      </w:pPr>
+    </w:p>
+    <w:p>
+      <w:pPr>
+        <w:rPr>
+          <w:rFonts w:ascii="Consolas" w:hAnsi="Consolas" w:cs="Calibri"/>
+          <w:sz w:val="18"/>
+        </w:rPr>
+      </w:pPr>
+      <w:r>
+        <w:rPr>
+          <w:rFonts w:ascii="Consolas" w:hAnsi="Consolas" w:cs="Calibri"/>
+          <w:sz w:val="18"/>
+        </w:rPr>
+        <w:t>{</w:t>
+      </w:r>
+    </w:p>
+    <w:p>
+      <w:pPr>
+        <w:rPr>
+          <w:rFonts w:ascii="Consolas" w:hAnsi="Consolas" w:cs="Calibri"/>
+          <w:sz w:val="18"/>
+        </w:rPr>
+      </w:pPr>
+      <w:r>
+        <w:rPr>
+          <w:rFonts w:ascii="Consolas" w:hAnsi="Consolas" w:cs="Calibri"/>
+          <w:sz w:val="18"/>
+        </w:rPr>
+        <w:t xml:space="preserve">  "status": true,</w:t>
+      </w:r>
+    </w:p>
+    <w:p>
+      <w:pPr>
+        <w:rPr>
+          <w:rFonts w:ascii="Consolas" w:hAnsi="Consolas" w:cs="Calibri"/>
+          <w:sz w:val="18"/>
+        </w:rPr>
+      </w:pPr>
+      <w:r>
+        <w:rPr>
+          <w:rFonts w:ascii="Consolas" w:hAnsi="Consolas" w:cs="Calibri"/>
+          <w:sz w:val="18"/>
+        </w:rPr>
+        <w:t xml:space="preserve">  "message": "string",</w:t>
+      </w:r>
+    </w:p>
+    <w:p>
+      <w:pPr>
+        <w:rPr>
+          <w:rFonts w:ascii="Consolas" w:hAnsi="Consolas" w:cs="Calibri"/>
+          <w:sz w:val="18"/>
+        </w:rPr>
+      </w:pPr>
+      <w:r>
+        <w:rPr>
+          <w:rFonts w:ascii="Consolas" w:hAnsi="Consolas" w:cs="Calibri"/>
+          <w:sz w:val="18"/>
+        </w:rPr>
+        <w:t xml:space="preserve">  "total": 0,</w:t>
+      </w:r>
+    </w:p>
+    <w:p>
+      <w:pPr>
+        <w:rPr>
+          <w:rFonts w:ascii="Consolas" w:hAnsi="Consolas" w:cs="Calibri"/>
+          <w:sz w:val="18"/>
+        </w:rPr>
+      </w:pPr>
+      <w:r>
+        <w:rPr>
+          <w:rFonts w:ascii="Consolas" w:hAnsi="Consolas" w:cs="Calibri"/>
+          <w:sz w:val="18"/>
+        </w:rPr>
+        <w:t xml:space="preserve">  "succeeded": 0,</w:t>
+      </w:r>
+    </w:p>
+    <w:p>
+      <w:pPr>
+        <w:rPr>
+          <w:rFonts w:ascii="Consolas" w:hAnsi="Consolas" w:cs="Calibri"/>
+          <w:sz w:val="18"/>
+        </w:rPr>
+      </w:pPr>
+      <w:r>
+        <w:rPr>
+          <w:rFonts w:ascii="Consolas" w:hAnsi="Consolas" w:cs="Calibri"/>
+          <w:sz w:val="18"/>
+        </w:rPr>
+        <w:t xml:space="preserve">  "failed": 0,</w:t>
+      </w:r>
+    </w:p>
+    <w:p>
+      <w:pPr>
+        <w:rPr>
+          <w:rFonts w:ascii="Consolas" w:hAnsi="Consolas" w:cs="Calibri"/>
+          <w:sz w:val="18"/>
+        </w:rPr>
+      </w:pPr>
+      <w:r>
+        <w:rPr>
+          <w:rFonts w:ascii="Consolas" w:hAnsi="Consolas" w:cs="Calibri"/>
+          <w:sz w:val="18"/>
+        </w:rPr>
+        <w:t xml:space="preserve">  "results": []</w:t>
+      </w:r>
+    </w:p>
+    <w:p>
+      <w:pPr>
+        <w:rPr>
+          <w:rFonts w:ascii="Consolas" w:hAnsi="Consolas" w:cs="Calibri"/>
+          <w:sz w:val="18"/>
+        </w:rPr>
+      </w:pPr>
+      <w:r>
+        <w:rPr>
+          <w:rFonts w:ascii="Consolas" w:hAnsi="Consolas" w:cs="Calibri"/>
+          <w:sz w:val="18"/>
+        </w:rPr>
+        <w:t>}</w:t>
       </w:r>
     </w:p>
     <w:p>
@@ -114,123 +329,6 @@
           <w:sz w:val="20"/>
         </w:rPr>
       </w:pPr>
-      <w:r>
-        <w:rPr>
-          <w:rFonts w:ascii="Calibri" w:hAnsi="Calibri" w:cs="Calibri"/>
-          <w:sz w:val="20"/>
-        </w:rPr>
-        <w:t>Or alternatively:</w:t>
-      </w:r>
-    </w:p>
-    <w:p>
-      <w:pPr>
-        <w:rPr>
-          <w:rFonts w:ascii="Consolas" w:hAnsi="Consolas" w:cs="Calibri"/>
-          <w:sz w:val="20"/>
-        </w:rPr>
-      </w:pPr>
-      <w:r>
-        <w:rPr>
-          <w:rFonts w:ascii="Consolas" w:hAnsi="Consolas" w:cs="Calibri"/>
-          <w:sz w:val="20"/>
-        </w:rPr>
-        <w:t>Authorization: Bearer &lt;your-api-key&gt;</w:t>
-      </w:r>
-    </w:p>
-    <w:p>
-      <w:pPr>
-        <w:rPr>
-          <w:rFonts w:ascii="Calibri" w:hAnsi="Calibri" w:cs="Calibri"/>
-          <w:sz w:val="20"/>
-        </w:rPr>
-      </w:pPr>
-      <w:r>
-        <w:rPr>
-          <w:rFonts w:ascii="Calibri" w:hAnsi="Calibri" w:cs="Calibri"/>
-          <w:sz w:val="20"/>
-        </w:rPr>
-        <w:t>The API key is shared separately. Do not expose it in client-side code.</w:t>
-      </w:r>
-    </w:p>
-    <w:p>
-      <w:pPr>
-        <w:rPr>
-          <w:rFonts w:ascii="Calibri" w:hAnsi="Calibri" w:cs="Calibri"/>
-          <w:sz w:val="20"/>
-        </w:rPr>
-      </w:pPr>
-    </w:p>
-    <w:p>
-      <w:pPr>
-        <w:rPr>
-          <w:rFonts w:ascii="Calibri" w:hAnsi="Calibri" w:cs="Calibri"/>
-          <w:b/>
-          <w:sz w:val="28"/>
-        </w:rPr>
-      </w:pPr>
-      <w:r>
-        <w:rPr>
-          <w:rFonts w:ascii="Calibri" w:hAnsi="Calibri" w:cs="Calibri"/>
-          <w:b/>
-          <w:sz w:val="28"/>
-        </w:rPr>
-        <w:t>1. Generate QR for Volunteers (Single)</w:t>
-      </w:r>
-    </w:p>
-    <w:p>
-      <w:pPr>
-        <w:rPr>
-          <w:rFonts w:ascii="Calibri" w:hAnsi="Calibri" w:cs="Calibri"/>
-          <w:sz w:val="20"/>
-        </w:rPr>
-      </w:pPr>
-      <w:r>
-        <w:rPr>
-          <w:rFonts w:ascii="Calibri" w:hAnsi="Calibri" w:cs="Calibri"/>
-          <w:sz w:val="20"/>
-        </w:rPr>
-        <w:t>Issue a QR pass for a single volunteer for a specific event.</w:t>
-      </w:r>
-    </w:p>
-    <w:p>
-      <w:pPr>
-        <w:rPr>
-          <w:rFonts w:ascii="Consolas" w:hAnsi="Consolas" w:cs="Calibri"/>
-          <w:sz w:val="20"/>
-        </w:rPr>
-      </w:pPr>
-      <w:r>
-        <w:rPr>
-          <w:rFonts w:ascii="Consolas" w:hAnsi="Consolas" w:cs="Calibri"/>
-          <w:sz w:val="20"/>
-        </w:rPr>
-        <w:t>POST /api/integration/generate-volunteer-qr</w:t>
-      </w:r>
-    </w:p>
-    <w:p>
-      <w:pPr>
-        <w:rPr>
-          <w:rFonts w:ascii="Calibri" w:hAnsi="Calibri" w:cs="Calibri"/>
-          <w:sz w:val="20"/>
-        </w:rPr>
-      </w:pPr>
-    </w:p>
-    <w:p>
-      <w:pPr>
-        <w:rPr>
-          <w:rFonts w:ascii="Calibri" w:hAnsi="Calibri" w:cs="Calibri"/>
-          <w:b/>
-          <w:sz w:val="20"/>
-        </w:rPr>
-      </w:pPr>
-      <w:r>
-        <w:rPr>
-          <w:rFonts w:ascii="Calibri" w:hAnsi="Calibri" w:cs="Calibri"/>
-          <w:b/>
-          <w:sz w:val="20"/>
-        </w:rPr>
-        <w:t>Request Body:</w:t>
-      </w:r>
     </w:p>
     <w:tbl>
       <w:tblPr>
@@ -247,10 +345,9 @@
         <w:tblLook w:val="0000" w:firstRow="0" w:lastRow="0" w:firstColumn="0" w:lastColumn="0" w:noHBand="0" w:noVBand="0"/>
       </w:tblPr>
       <w:tblGrid>
-        <w:gridCol w:w="2256"/>
-        <w:gridCol w:w="2256"/>
-        <w:gridCol w:w="2257"/>
-        <w:gridCol w:w="2257"/>
+        <w:gridCol w:w="3008"/>
+        <w:gridCol w:w="3009"/>
+        <w:gridCol w:w="3009"/>
       </w:tblGrid>
       <w:tr>
         <w:tblPrEx>
@@ -261,7 +358,7 @@
         </w:tblPrEx>
         <w:tc>
           <w:tcPr>
-            <w:tcW w:w="2256" w:type="dxa"/>
+            <w:tcW w:w="3008" w:type="dxa"/>
           </w:tcPr>
           <w:p>
             <w:pPr>
@@ -282,30 +379,63 @@
             <w:pPr>
               <w:rPr>
                 <w:rFonts w:ascii="Calibri" w:hAnsi="Calibri" w:cs="Calibri"/>
+                <w:sz w:val="20"/>
+              </w:rPr>
+            </w:pPr>
+          </w:p>
+          <w:p>
+            <w:pPr>
+              <w:rPr>
+                <w:rFonts w:ascii="Calibri" w:hAnsi="Calibri" w:cs="Calibri"/>
                 <w:b/>
-                <w:sz w:val="20"/>
+                <w:sz w:val="28"/>
               </w:rPr>
             </w:pPr>
             <w:r>
               <w:rPr>
                 <w:rFonts w:ascii="Calibri" w:hAnsi="Calibri" w:cs="Calibri"/>
                 <w:b/>
-                <w:sz w:val="20"/>
-              </w:rPr>
-              <w:t>Example Request:</w:t>
+                <w:sz w:val="28"/>
+              </w:rPr>
+              <w:t>1. Generate QR Pass (Bulk)</w:t>
             </w:r>
           </w:p>
           <w:p>
             <w:pPr>
               <w:rPr>
-                <w:rFonts w:ascii="Consolas" w:hAnsi="Consolas" w:cs="Calibri"/>
-                <w:sz w:val="18"/>
+                <w:rFonts w:ascii="Calibri" w:hAnsi="Calibri" w:cs="Calibri"/>
+                <w:sz w:val="20"/>
               </w:rPr>
             </w:pPr>
             <w:r>
               <w:rPr>
+                <w:rFonts w:ascii="Calibri" w:hAnsi="Calibri" w:cs="Calibri"/>
+                <w:sz w:val="20"/>
+              </w:rPr>
+              <w:t>Generates QR passes for multiple volunteers at once for a specific festival/event. If a volunteer does not already exist (matched by mobile number), a new holder record is created automatically. If a volunteer already has an active QR pass for the given event, the existing QR ID is returned instead of creating a duplicate.</w:t>
+            </w:r>
+          </w:p>
+          <w:p>
+            <w:pPr>
+              <w:rPr>
+                <w:rFonts w:ascii="Calibri" w:hAnsi="Calibri" w:cs="Calibri"/>
+                <w:sz w:val="20"/>
+              </w:rPr>
+            </w:pPr>
+          </w:p>
+          <w:p>
+            <w:pPr>
+              <w:rPr>
                 <w:rFonts w:ascii="Consolas" w:hAnsi="Consolas" w:cs="Calibri"/>
-                <w:sz w:val="18"/>
+                <w:b/>
+                <w:sz w:val="20"/>
+              </w:rPr>
+            </w:pPr>
+            <w:r>
+              <w:rPr>
+                <w:rFonts w:ascii="Consolas" w:hAnsi="Consolas" w:cs="Calibri"/>
+                <w:b/>
+                <w:sz w:val="20"/>
               </w:rPr>
               <w:t>POST /api/integration/generate-volunteer-qr</w:t>
             </w:r>
@@ -317,305 +447,22 @@
                 <w:sz w:val="20"/>
               </w:rPr>
             </w:pPr>
-            <w:r>
-              <w:rPr>
-                <w:rFonts w:ascii="Calibri" w:hAnsi="Calibri" w:cs="Calibri"/>
-                <w:sz w:val="20"/>
-              </w:rPr>
-              <w:t>Content-Type: application/json</w:t>
-            </w:r>
           </w:p>
           <w:p>
             <w:pPr>
               <w:rPr>
                 <w:rFonts w:ascii="Calibri" w:hAnsi="Calibri" w:cs="Calibri"/>
+                <w:b/>
                 <w:sz w:val="20"/>
               </w:rPr>
             </w:pPr>
             <w:r>
               <w:rPr>
                 <w:rFonts w:ascii="Calibri" w:hAnsi="Calibri" w:cs="Calibri"/>
-                <w:sz w:val="20"/>
-              </w:rPr>
-              <w:t>X-API-Key: your-api-key-here</w:t>
-            </w:r>
-          </w:p>
-          <w:p>
-            <w:pPr>
-              <w:rPr>
-                <w:rFonts w:ascii="Calibri" w:hAnsi="Calibri" w:cs="Calibri"/>
-                <w:sz w:val="20"/>
-              </w:rPr>
-            </w:pPr>
-          </w:p>
-          <w:p>
-            <w:pPr>
-              <w:rPr>
-                <w:rFonts w:ascii="Calibri" w:hAnsi="Calibri" w:cs="Calibri"/>
-                <w:sz w:val="20"/>
-              </w:rPr>
-            </w:pPr>
-            <w:r>
-              <w:rPr>
-                <w:rFonts w:ascii="Calibri" w:hAnsi="Calibri" w:cs="Calibri"/>
-                <w:sz w:val="20"/>
-              </w:rPr>
-              <w:t>{</w:t>
-            </w:r>
-          </w:p>
-          <w:p>
-            <w:pPr>
-              <w:rPr>
-                <w:rFonts w:ascii="Calibri" w:hAnsi="Calibri" w:cs="Calibri"/>
-                <w:sz w:val="20"/>
-              </w:rPr>
-            </w:pPr>
-            <w:r>
-              <w:rPr>
-                <w:rFonts w:ascii="Calibri" w:hAnsi="Calibri" w:cs="Calibri"/>
-                <w:sz w:val="20"/>
-              </w:rPr>
-              <w:t xml:space="preserve">  "event_id": "TST2",</w:t>
-            </w:r>
-          </w:p>
-          <w:p>
-            <w:pPr>
-              <w:rPr>
-                <w:rFonts w:ascii="Calibri" w:hAnsi="Calibri" w:cs="Calibri"/>
-                <w:sz w:val="20"/>
-              </w:rPr>
-            </w:pPr>
-            <w:r>
-              <w:rPr>
-                <w:rFonts w:ascii="Calibri" w:hAnsi="Calibri" w:cs="Calibri"/>
-                <w:sz w:val="20"/>
-              </w:rPr>
-              <w:t xml:space="preserve">  "user_phone_number": "9876543210",</w:t>
-            </w:r>
-          </w:p>
-          <w:p>
-            <w:pPr>
-              <w:rPr>
-                <w:rFonts w:ascii="Calibri" w:hAnsi="Calibri" w:cs="Calibri"/>
-                <w:sz w:val="20"/>
-              </w:rPr>
-            </w:pPr>
-            <w:r>
-              <w:rPr>
-                <w:rFonts w:ascii="Calibri" w:hAnsi="Calibri" w:cs="Calibri"/>
-                <w:sz w:val="20"/>
-              </w:rPr>
-              <w:t xml:space="preserve">  "name": "Ramesh Kumar",</w:t>
-            </w:r>
-          </w:p>
-          <w:p>
-            <w:pPr>
-              <w:rPr>
-                <w:rFonts w:ascii="Calibri" w:hAnsi="Calibri" w:cs="Calibri"/>
-                <w:sz w:val="20"/>
-              </w:rPr>
-            </w:pPr>
-            <w:r>
-              <w:rPr>
-                <w:rFonts w:ascii="Calibri" w:hAnsi="Calibri" w:cs="Calibri"/>
-                <w:sz w:val="20"/>
-              </w:rPr>
-              <w:t xml:space="preserve">  "category": "INV"</w:t>
-            </w:r>
-          </w:p>
-          <w:p>
-            <w:pPr>
-              <w:rPr>
-                <w:rFonts w:ascii="Calibri" w:hAnsi="Calibri" w:cs="Calibri"/>
-                <w:sz w:val="20"/>
-              </w:rPr>
-            </w:pPr>
-            <w:r>
-              <w:rPr>
-                <w:rFonts w:ascii="Calibri" w:hAnsi="Calibri" w:cs="Calibri"/>
-                <w:sz w:val="20"/>
-              </w:rPr>
-              <w:t>}</w:t>
-            </w:r>
-          </w:p>
-          <w:p>
-            <w:pPr>
-              <w:rPr>
-                <w:rFonts w:ascii="Calibri" w:hAnsi="Calibri" w:cs="Calibri"/>
-                <w:sz w:val="20"/>
-              </w:rPr>
-            </w:pPr>
-          </w:p>
-          <w:p>
-            <w:pPr>
-              <w:rPr>
-                <w:rFonts w:ascii="Calibri" w:hAnsi="Calibri" w:cs="Calibri"/>
                 <w:b/>
                 <w:sz w:val="20"/>
               </w:rPr>
-            </w:pPr>
-            <w:r>
-              <w:rPr>
-                <w:rFonts w:ascii="Calibri" w:hAnsi="Calibri" w:cs="Calibri"/>
-                <w:b/>
-                <w:sz w:val="20"/>
-              </w:rPr>
-              <w:t>Success Response:</w:t>
-            </w:r>
-          </w:p>
-          <w:p>
-            <w:pPr>
-              <w:rPr>
-                <w:rFonts w:ascii="Consolas" w:hAnsi="Consolas" w:cs="Calibri"/>
-                <w:sz w:val="18"/>
-              </w:rPr>
-            </w:pPr>
-            <w:r>
-              <w:rPr>
-                <w:rFonts w:ascii="Consolas" w:hAnsi="Consolas" w:cs="Calibri"/>
-                <w:sz w:val="18"/>
-              </w:rPr>
-              <w:t>{</w:t>
-            </w:r>
-          </w:p>
-          <w:p>
-            <w:pPr>
-              <w:rPr>
-                <w:rFonts w:ascii="Calibri" w:hAnsi="Calibri" w:cs="Calibri"/>
-                <w:sz w:val="20"/>
-              </w:rPr>
-            </w:pPr>
-            <w:r>
-              <w:rPr>
-                <w:rFonts w:ascii="Calibri" w:hAnsi="Calibri" w:cs="Calibri"/>
-                <w:sz w:val="20"/>
-              </w:rPr>
-              <w:t xml:space="preserve">  "status": true,</w:t>
-            </w:r>
-          </w:p>
-          <w:p>
-            <w:pPr>
-              <w:rPr>
-                <w:rFonts w:ascii="Calibri" w:hAnsi="Calibri" w:cs="Calibri"/>
-                <w:sz w:val="20"/>
-              </w:rPr>
-            </w:pPr>
-            <w:r>
-              <w:rPr>
-                <w:rFonts w:ascii="Calibri" w:hAnsi="Calibri" w:cs="Calibri"/>
-                <w:sz w:val="20"/>
-              </w:rPr>
-              <w:t xml:space="preserve">  "message": "QR code generated successfully",</w:t>
-            </w:r>
-          </w:p>
-          <w:p>
-            <w:pPr>
-              <w:rPr>
-                <w:rFonts w:ascii="Calibri" w:hAnsi="Calibri" w:cs="Calibri"/>
-                <w:sz w:val="20"/>
-              </w:rPr>
-            </w:pPr>
-            <w:r>
-              <w:rPr>
-                <w:rFonts w:ascii="Calibri" w:hAnsi="Calibri" w:cs="Calibri"/>
-                <w:sz w:val="20"/>
-              </w:rPr>
-              <w:t xml:space="preserve">  "qr_id": "TST2-INV-0001"</w:t>
-            </w:r>
-          </w:p>
-          <w:p>
-            <w:pPr>
-              <w:rPr>
-                <w:rFonts w:ascii="Calibri" w:hAnsi="Calibri" w:cs="Calibri"/>
-                <w:sz w:val="20"/>
-              </w:rPr>
-            </w:pPr>
-            <w:r>
-              <w:rPr>
-                <w:rFonts w:ascii="Calibri" w:hAnsi="Calibri" w:cs="Calibri"/>
-                <w:sz w:val="20"/>
-              </w:rPr>
-              <w:t>}</w:t>
-            </w:r>
-          </w:p>
-          <w:p>
-            <w:pPr>
-              <w:rPr>
-                <w:rFonts w:ascii="Calibri" w:hAnsi="Calibri" w:cs="Calibri"/>
-                <w:sz w:val="20"/>
-              </w:rPr>
-            </w:pPr>
-          </w:p>
-          <w:p>
-            <w:pPr>
-              <w:rPr>
-                <w:rFonts w:ascii="Calibri" w:hAnsi="Calibri" w:cs="Calibri"/>
-                <w:b/>
-                <w:sz w:val="28"/>
-              </w:rPr>
-            </w:pPr>
-            <w:r>
-              <w:rPr>
-                <w:rFonts w:ascii="Calibri" w:hAnsi="Calibri" w:cs="Calibri"/>
-                <w:b/>
-                <w:sz w:val="28"/>
-              </w:rPr>
-              <w:t>2. Generate QR for Volunteers (Bulk) - PRIMARY ENDPOINT</w:t>
-            </w:r>
-          </w:p>
-          <w:p>
-            <w:pPr>
-              <w:rPr>
-                <w:rFonts w:ascii="Calibri" w:hAnsi="Calibri" w:cs="Calibri"/>
-                <w:sz w:val="20"/>
-              </w:rPr>
-            </w:pPr>
-            <w:r>
-              <w:rPr>
-                <w:rFonts w:ascii="Calibri" w:hAnsi="Calibri" w:cs="Calibri"/>
-                <w:sz w:val="20"/>
-              </w:rPr>
-              <w:t>Issue QR passes for multiple volunteers at once. This is the main endpoint the app should use when a devotee selects volunteers and clicks Generate QR.</w:t>
-            </w:r>
-          </w:p>
-          <w:p>
-            <w:pPr>
-              <w:rPr>
-                <w:rFonts w:ascii="Consolas" w:hAnsi="Consolas" w:cs="Calibri"/>
-                <w:sz w:val="20"/>
-              </w:rPr>
-            </w:pPr>
-            <w:r>
-              <w:rPr>
-                <w:rFonts w:ascii="Consolas" w:hAnsi="Consolas" w:cs="Calibri"/>
-                <w:sz w:val="20"/>
-              </w:rPr>
-              <w:t>POST /api/integration/generate-volunteer-qr/bulk</w:t>
-            </w:r>
-          </w:p>
-          <w:p>
-            <w:pPr>
-              <w:rPr>
-                <w:rFonts w:ascii="Calibri" w:hAnsi="Calibri" w:cs="Calibri"/>
-                <w:sz w:val="20"/>
-              </w:rPr>
-            </w:pPr>
-          </w:p>
-          <w:p>
-            <w:pPr>
-              <w:rPr>
-                <w:rFonts w:ascii="Calibri" w:hAnsi="Calibri" w:cs="Calibri"/>
-                <w:b/>
-                <w:sz w:val="20"/>
-              </w:rPr>
-            </w:pPr>
-            <w:r>
-              <w:rPr>
-                <w:rFonts w:ascii="Calibri" w:hAnsi="Calibri" w:cs="Calibri"/>
-                <w:b/>
-                <w:sz w:val="20"/>
-              </w:rPr>
-              <w:t>Request Body:</w:t>
+              <w:t>Request Body Parameters</w:t>
             </w:r>
           </w:p>
           <w:tbl>
@@ -633,10 +480,10 @@
               <w:tblLook w:val="0000" w:firstRow="0" w:lastRow="0" w:firstColumn="0" w:lastColumn="0" w:noHBand="0" w:noVBand="0"/>
             </w:tblPr>
             <w:tblGrid>
-              <w:gridCol w:w="510"/>
-              <w:gridCol w:w="510"/>
-              <w:gridCol w:w="510"/>
-              <w:gridCol w:w="510"/>
+              <w:gridCol w:w="698"/>
+              <w:gridCol w:w="698"/>
+              <w:gridCol w:w="698"/>
+              <w:gridCol w:w="698"/>
             </w:tblGrid>
             <w:tr>
               <w:tblPrEx>
@@ -647,7 +494,7 @@
               </w:tblPrEx>
               <w:tc>
                 <w:tcPr>
-                  <w:tcW w:w="510" w:type="dxa"/>
+                  <w:tcW w:w="698" w:type="dxa"/>
                 </w:tcPr>
                 <w:p>
                   <w:pPr>
@@ -668,6 +515,14 @@
                   <w:pPr>
                     <w:rPr>
                       <w:rFonts w:ascii="Calibri" w:hAnsi="Calibri" w:cs="Calibri"/>
+                      <w:sz w:val="20"/>
+                    </w:rPr>
+                  </w:pPr>
+                </w:p>
+                <w:p>
+                  <w:pPr>
+                    <w:rPr>
+                      <w:rFonts w:ascii="Calibri" w:hAnsi="Calibri" w:cs="Calibri"/>
                       <w:b/>
                       <w:sz w:val="20"/>
                     </w:rPr>
@@ -678,7 +533,7 @@
                       <w:b/>
                       <w:sz w:val="20"/>
                     </w:rPr>
-                    <w:t>Example Request:</w:t>
+                    <w:t>Sample Request</w:t>
                   </w:r>
                 </w:p>
                 <w:p>
@@ -693,6 +548,44 @@
                       <w:rFonts w:ascii="Consolas" w:hAnsi="Consolas" w:cs="Calibri"/>
                       <w:sz w:val="18"/>
                     </w:rPr>
+                    <w:t>POST https://iskcon-seva-pass-backend-production.up.railway.app/api/integration/generate-volunteer-qr</w:t>
+                  </w:r>
+                </w:p>
+                <w:p>
+                  <w:pPr>
+                    <w:rPr>
+                      <w:rFonts w:ascii="Calibri" w:hAnsi="Calibri" w:cs="Calibri"/>
+                      <w:sz w:val="20"/>
+                    </w:rPr>
+                  </w:pPr>
+                  <w:r>
+                    <w:rPr>
+                      <w:rFonts w:ascii="Calibri" w:hAnsi="Calibri" w:cs="Calibri"/>
+                      <w:sz w:val="20"/>
+                    </w:rPr>
+                    <w:t>Content-Type: application/json</w:t>
+                  </w:r>
+                </w:p>
+                <w:p>
+                  <w:pPr>
+                    <w:rPr>
+                      <w:rFonts w:ascii="Calibri" w:hAnsi="Calibri" w:cs="Calibri"/>
+                      <w:sz w:val="20"/>
+                    </w:rPr>
+                  </w:pPr>
+                </w:p>
+                <w:p>
+                  <w:pPr>
+                    <w:rPr>
+                      <w:rFonts w:ascii="Calibri" w:hAnsi="Calibri" w:cs="Calibri"/>
+                      <w:sz w:val="20"/>
+                    </w:rPr>
+                  </w:pPr>
+                  <w:r>
+                    <w:rPr>
+                      <w:rFonts w:ascii="Calibri" w:hAnsi="Calibri" w:cs="Calibri"/>
+                      <w:sz w:val="20"/>
+                    </w:rPr>
                     <w:t>{</w:t>
                   </w:r>
                 </w:p>
@@ -723,21 +616,6 @@
                       <w:rFonts w:ascii="Calibri" w:hAnsi="Calibri" w:cs="Calibri"/>
                       <w:sz w:val="20"/>
                     </w:rPr>
-                    <w:t xml:space="preserve">  "category": "INV",</w:t>
-                  </w:r>
-                </w:p>
-                <w:p>
-                  <w:pPr>
-                    <w:rPr>
-                      <w:rFonts w:ascii="Calibri" w:hAnsi="Calibri" w:cs="Calibri"/>
-                      <w:sz w:val="20"/>
-                    </w:rPr>
-                  </w:pPr>
-                  <w:r>
-                    <w:rPr>
-                      <w:rFonts w:ascii="Calibri" w:hAnsi="Calibri" w:cs="Calibri"/>
-                      <w:sz w:val="20"/>
-                    </w:rPr>
                     <w:t xml:space="preserve">  "holders": [</w:t>
                   </w:r>
                 </w:p>
@@ -783,7 +661,7 @@
                       <w:rFonts w:ascii="Calibri" w:hAnsi="Calibri" w:cs="Calibri"/>
                       <w:sz w:val="20"/>
                     </w:rPr>
-                    <w:t xml:space="preserve">    { "user_phone_number": "8765432109", "name": "Prasad Reddy" }</w:t>
+                    <w:t xml:space="preserve">    { "user_phone_number": "8765432109" }</w:t>
                   </w:r>
                 </w:p>
                 <w:p>
@@ -828,6 +706,14 @@
                   <w:pPr>
                     <w:rPr>
                       <w:rFonts w:ascii="Calibri" w:hAnsi="Calibri" w:cs="Calibri"/>
+                      <w:sz w:val="20"/>
+                    </w:rPr>
+                  </w:pPr>
+                </w:p>
+                <w:p>
+                  <w:pPr>
+                    <w:rPr>
+                      <w:rFonts w:ascii="Calibri" w:hAnsi="Calibri" w:cs="Calibri"/>
                       <w:b/>
                       <w:sz w:val="20"/>
                     </w:rPr>
@@ -838,7 +724,39 @@
                       <w:b/>
                       <w:sz w:val="20"/>
                     </w:rPr>
-                    <w:t>Success Response:</w:t>
+                    <w:t>Sample Response</w:t>
+                  </w:r>
+                </w:p>
+                <w:p>
+                  <w:pPr>
+                    <w:rPr>
+                      <w:rFonts w:ascii="Calibri" w:hAnsi="Calibri" w:cs="Calibri"/>
+                      <w:sz w:val="20"/>
+                    </w:rPr>
+                  </w:pPr>
+                  <w:r>
+                    <w:rPr>
+                      <w:rFonts w:ascii="Calibri" w:hAnsi="Calibri" w:cs="Calibri"/>
+                      <w:sz w:val="20"/>
+                    </w:rPr>
+                    <w:t>Success - All volunteers processed:</w:t>
+                  </w:r>
+                </w:p>
+                <w:p>
+                  <w:pPr>
+                    <w:rPr>
+                      <w:rFonts w:ascii="Calibri" w:hAnsi="Calibri" w:cs="Calibri"/>
+                      <w:b/>
+                      <w:sz w:val="20"/>
+                    </w:rPr>
+                  </w:pPr>
+                  <w:r>
+                    <w:rPr>
+                      <w:rFonts w:ascii="Calibri" w:hAnsi="Calibri" w:cs="Calibri"/>
+                      <w:b/>
+                      <w:sz w:val="20"/>
+                    </w:rPr>
+                    <w:t>HTTP 200 OK</w:t>
                   </w:r>
                 </w:p>
                 <w:p>
@@ -1303,6 +1221,165 @@
                   <w:pPr>
                     <w:rPr>
                       <w:rFonts w:ascii="Calibri" w:hAnsi="Calibri" w:cs="Calibri"/>
+                      <w:sz w:val="20"/>
+                    </w:rPr>
+                  </w:pPr>
+                </w:p>
+                <w:p>
+                  <w:pPr>
+                    <w:rPr>
+                      <w:rFonts w:ascii="Calibri" w:hAnsi="Calibri" w:cs="Calibri"/>
+                      <w:sz w:val="20"/>
+                    </w:rPr>
+                  </w:pPr>
+                  <w:r>
+                    <w:rPr>
+                      <w:rFonts w:ascii="Calibri" w:hAnsi="Calibri" w:cs="Calibri"/>
+                      <w:sz w:val="20"/>
+                    </w:rPr>
+                    <w:t>Success - Volunteer already has an active QR (duplicate check):</w:t>
+                  </w:r>
+                </w:p>
+                <w:p>
+                  <w:pPr>
+                    <w:rPr>
+                      <w:rFonts w:ascii="Consolas" w:hAnsi="Consolas" w:cs="Calibri"/>
+                      <w:sz w:val="18"/>
+                    </w:rPr>
+                  </w:pPr>
+                  <w:r>
+                    <w:rPr>
+                      <w:rFonts w:ascii="Consolas" w:hAnsi="Consolas" w:cs="Calibri"/>
+                      <w:sz w:val="18"/>
+                    </w:rPr>
+                    <w:t>{</w:t>
+                  </w:r>
+                </w:p>
+                <w:p>
+                  <w:pPr>
+                    <w:rPr>
+                      <w:rFonts w:ascii="Calibri" w:hAnsi="Calibri" w:cs="Calibri"/>
+                      <w:sz w:val="20"/>
+                    </w:rPr>
+                  </w:pPr>
+                  <w:r>
+                    <w:rPr>
+                      <w:rFonts w:ascii="Calibri" w:hAnsi="Calibri" w:cs="Calibri"/>
+                      <w:sz w:val="20"/>
+                    </w:rPr>
+                    <w:t xml:space="preserve">  "success": true,</w:t>
+                  </w:r>
+                </w:p>
+                <w:p>
+                  <w:pPr>
+                    <w:rPr>
+                      <w:rFonts w:ascii="Calibri" w:hAnsi="Calibri" w:cs="Calibri"/>
+                      <w:sz w:val="20"/>
+                    </w:rPr>
+                  </w:pPr>
+                  <w:r>
+                    <w:rPr>
+                      <w:rFonts w:ascii="Calibri" w:hAnsi="Calibri" w:cs="Calibri"/>
+                      <w:sz w:val="20"/>
+                    </w:rPr>
+                    <w:t xml:space="preserve">  "reused": true,</w:t>
+                  </w:r>
+                </w:p>
+                <w:p>
+                  <w:pPr>
+                    <w:rPr>
+                      <w:rFonts w:ascii="Calibri" w:hAnsi="Calibri" w:cs="Calibri"/>
+                      <w:sz w:val="20"/>
+                    </w:rPr>
+                  </w:pPr>
+                  <w:r>
+                    <w:rPr>
+                      <w:rFonts w:ascii="Calibri" w:hAnsi="Calibri" w:cs="Calibri"/>
+                      <w:sz w:val="20"/>
+                    </w:rPr>
+                    <w:t xml:space="preserve">  "name": "Prasad Reddy",</w:t>
+                  </w:r>
+                </w:p>
+                <w:p>
+                  <w:pPr>
+                    <w:rPr>
+                      <w:rFonts w:ascii="Calibri" w:hAnsi="Calibri" w:cs="Calibri"/>
+                      <w:sz w:val="20"/>
+                    </w:rPr>
+                  </w:pPr>
+                  <w:r>
+                    <w:rPr>
+                      <w:rFonts w:ascii="Calibri" w:hAnsi="Calibri" w:cs="Calibri"/>
+                      <w:sz w:val="20"/>
+                    </w:rPr>
+                    <w:t xml:space="preserve">  "phone": "918765432109",</w:t>
+                  </w:r>
+                </w:p>
+                <w:p>
+                  <w:pPr>
+                    <w:rPr>
+                      <w:rFonts w:ascii="Calibri" w:hAnsi="Calibri" w:cs="Calibri"/>
+                      <w:sz w:val="20"/>
+                    </w:rPr>
+                  </w:pPr>
+                  <w:r>
+                    <w:rPr>
+                      <w:rFonts w:ascii="Calibri" w:hAnsi="Calibri" w:cs="Calibri"/>
+                      <w:sz w:val="20"/>
+                    </w:rPr>
+                    <w:t xml:space="preserve">  "qr_id": "TST2-INV-0003"</w:t>
+                  </w:r>
+                </w:p>
+                <w:p>
+                  <w:pPr>
+                    <w:rPr>
+                      <w:rFonts w:ascii="Calibri" w:hAnsi="Calibri" w:cs="Calibri"/>
+                      <w:sz w:val="20"/>
+                    </w:rPr>
+                  </w:pPr>
+                  <w:r>
+                    <w:rPr>
+                      <w:rFonts w:ascii="Calibri" w:hAnsi="Calibri" w:cs="Calibri"/>
+                      <w:sz w:val="20"/>
+                    </w:rPr>
+                    <w:t>}</w:t>
+                  </w:r>
+                </w:p>
+                <w:p>
+                  <w:pPr>
+                    <w:rPr>
+                      <w:rFonts w:ascii="Calibri" w:hAnsi="Calibri" w:cs="Calibri"/>
+                      <w:sz w:val="20"/>
+                    </w:rPr>
+                  </w:pPr>
+                </w:p>
+                <w:p>
+                  <w:pPr>
+                    <w:rPr>
+                      <w:rFonts w:ascii="Calibri" w:hAnsi="Calibri" w:cs="Calibri"/>
+                      <w:sz w:val="20"/>
+                    </w:rPr>
+                  </w:pPr>
+                  <w:r>
+                    <w:rPr>
+                      <w:rFonts w:ascii="Calibri" w:hAnsi="Calibri" w:cs="Calibri"/>
+                      <w:sz w:val="20"/>
+                    </w:rPr>
+                    <w:t>Note: A duplicate is detected by the combination of event and phone number. If a holder already has an active QR pass for the given event, the existing qr_id is returned with reused: true. No duplicate QR pass is created.</w:t>
+                  </w:r>
+                </w:p>
+                <w:p>
+                  <w:pPr>
+                    <w:rPr>
+                      <w:rFonts w:ascii="Calibri" w:hAnsi="Calibri" w:cs="Calibri"/>
+                      <w:sz w:val="20"/>
+                    </w:rPr>
+                  </w:pPr>
+                </w:p>
+                <w:p>
+                  <w:pPr>
+                    <w:rPr>
+                      <w:rFonts w:ascii="Calibri" w:hAnsi="Calibri" w:cs="Calibri"/>
                       <w:b/>
                       <w:sz w:val="20"/>
                     </w:rPr>
@@ -1313,12 +1390,12 @@
                       <w:b/>
                       <w:sz w:val="20"/>
                     </w:rPr>
-                    <w:t>Response Fields:</w:t>
+                    <w:t>Response Fields</w:t>
                   </w:r>
                 </w:p>
                 <w:tbl>
                   <w:tblPr>
-                    <w:tblW w:w="720" w:type="dxa"/>
+                    <w:tblW w:w="1080" w:type="dxa"/>
                     <w:tblBorders>
                       <w:top w:val="single" w:sz="4" w:space="0" w:color="auto"/>
                       <w:left w:val="single" w:sz="4" w:space="0" w:color="auto"/>
@@ -1333,6 +1410,7 @@
                   <w:tblGrid>
                     <w:gridCol w:w="360"/>
                     <w:gridCol w:w="360"/>
+                    <w:gridCol w:w="360"/>
                   </w:tblGrid>
                   <w:tr>
                     <w:tblPrEx>
@@ -1373,46 +1451,321 @@
                           <w:rPr>
                             <w:rFonts w:ascii="Calibri" w:hAnsi="Calibri" w:cs="Calibri"/>
                             <w:b/>
-                            <w:sz w:val="28"/>
+                            <w:sz w:val="20"/>
                           </w:rPr>
                         </w:pPr>
                         <w:r>
                           <w:rPr>
                             <w:rFonts w:ascii="Calibri" w:hAnsi="Calibri" w:cs="Calibri"/>
                             <w:b/>
-                            <w:sz w:val="28"/>
-                          </w:rPr>
-                          <w:t>3. Get QR Pass Status</w:t>
-                        </w:r>
-                      </w:p>
-                      <w:p>
-                        <w:pPr>
-                          <w:rPr>
-                            <w:rFonts w:ascii="Calibri" w:hAnsi="Calibri" w:cs="Calibri"/>
-                            <w:sz w:val="20"/>
-                          </w:rPr>
-                        </w:pPr>
-                        <w:r>
-                          <w:rPr>
-                            <w:rFonts w:ascii="Calibri" w:hAnsi="Calibri" w:cs="Calibri"/>
-                            <w:sz w:val="20"/>
-                          </w:rPr>
-                          <w:t>Check the live status and scan history of a QR pass.</w:t>
+                            <w:sz w:val="20"/>
+                          </w:rPr>
+                          <w:t>QR ID Format</w:t>
+                        </w:r>
+                      </w:p>
+                      <w:p>
+                        <w:pPr>
+                          <w:rPr>
+                            <w:rFonts w:ascii="Calibri" w:hAnsi="Calibri" w:cs="Calibri"/>
+                            <w:sz w:val="20"/>
+                          </w:rPr>
+                        </w:pPr>
+                        <w:r>
+                          <w:rPr>
+                            <w:rFonts w:ascii="Calibri" w:hAnsi="Calibri" w:cs="Calibri"/>
+                            <w:sz w:val="20"/>
+                          </w:rPr>
+                          <w:t>QR IDs follow the pattern: {eventCode}-{categoryCode}-{sequence}</w:t>
+                        </w:r>
+                      </w:p>
+                      <w:p>
+                        <w:pPr>
+                          <w:rPr>
+                            <w:rFonts w:ascii="Calibri" w:hAnsi="Calibri" w:cs="Calibri"/>
+                            <w:sz w:val="20"/>
+                          </w:rPr>
+                        </w:pPr>
+                        <w:r>
+                          <w:rPr>
+                            <w:rFonts w:ascii="Calibri" w:hAnsi="Calibri" w:cs="Calibri"/>
+                            <w:sz w:val="20"/>
+                          </w:rPr>
+                          <w:t>Example: TST2-INV-0001, TST2-SP-0042</w:t>
+                        </w:r>
+                      </w:p>
+                      <w:p>
+                        <w:pPr>
+                          <w:rPr>
+                            <w:rFonts w:ascii="Calibri" w:hAnsi="Calibri" w:cs="Calibri"/>
+                            <w:sz w:val="20"/>
+                          </w:rPr>
+                        </w:pPr>
+                        <w:r>
+                          <w:rPr>
+                            <w:rFonts w:ascii="Calibri" w:hAnsi="Calibri" w:cs="Calibri"/>
+                            <w:sz w:val="20"/>
+                          </w:rPr>
+                          <w:t>The mobile app should convert this QR ID string into a QR code image for display.</w:t>
+                        </w:r>
+                      </w:p>
+                      <w:p>
+                        <w:pPr>
+                          <w:rPr>
+                            <w:rFonts w:ascii="Calibri" w:hAnsi="Calibri" w:cs="Calibri"/>
+                            <w:sz w:val="20"/>
+                          </w:rPr>
+                        </w:pPr>
+                      </w:p>
+                      <w:p>
+                        <w:pPr>
+                          <w:rPr>
+                            <w:rFonts w:ascii="Calibri" w:hAnsi="Calibri" w:cs="Calibri"/>
+                            <w:b/>
+                            <w:sz w:val="20"/>
+                          </w:rPr>
+                        </w:pPr>
+                        <w:r>
+                          <w:rPr>
+                            <w:rFonts w:ascii="Calibri" w:hAnsi="Calibri" w:cs="Calibri"/>
+                            <w:b/>
+                            <w:sz w:val="20"/>
+                          </w:rPr>
+                          <w:t>Event ID Resolution</w:t>
+                        </w:r>
+                      </w:p>
+                      <w:p>
+                        <w:pPr>
+                          <w:rPr>
+                            <w:rFonts w:ascii="Calibri" w:hAnsi="Calibri" w:cs="Calibri"/>
+                            <w:sz w:val="20"/>
+                          </w:rPr>
+                        </w:pPr>
+                        <w:r>
+                          <w:rPr>
+                            <w:rFonts w:ascii="Calibri" w:hAnsi="Calibri" w:cs="Calibri"/>
+                            <w:sz w:val="20"/>
+                          </w:rPr>
+                          <w:t>The event_id field is matched in the following order:</w:t>
+                        </w:r>
+                      </w:p>
+                      <w:p>
+                        <w:pPr>
+                          <w:rPr>
+                            <w:rFonts w:ascii="Calibri" w:hAnsi="Calibri" w:cs="Calibri"/>
+                            <w:sz w:val="20"/>
+                          </w:rPr>
+                        </w:pPr>
+                        <w:r>
+                          <w:rPr>
+                            <w:rFonts w:ascii="Calibri" w:hAnsi="Calibri" w:cs="Calibri"/>
+                            <w:sz w:val="20"/>
+                          </w:rPr>
+                          <w:t>1. Event code (e.g. TST2) - case-insensitive</w:t>
+                        </w:r>
+                      </w:p>
+                      <w:p>
+                        <w:pPr>
+                          <w:rPr>
+                            <w:rFonts w:ascii="Calibri" w:hAnsi="Calibri" w:cs="Calibri"/>
+                            <w:sz w:val="20"/>
+                          </w:rPr>
+                        </w:pPr>
+                        <w:r>
+                          <w:rPr>
+                            <w:rFonts w:ascii="Calibri" w:hAnsi="Calibri" w:cs="Calibri"/>
+                            <w:sz w:val="20"/>
+                          </w:rPr>
+                          <w:t>2. Third-party event ID (e.g. EVT1024) - if configured</w:t>
+                        </w:r>
+                      </w:p>
+                      <w:p>
+                        <w:pPr>
+                          <w:rPr>
+                            <w:rFonts w:ascii="Calibri" w:hAnsi="Calibri" w:cs="Calibri"/>
+                            <w:sz w:val="20"/>
+                          </w:rPr>
+                        </w:pPr>
+                        <w:r>
+                          <w:rPr>
+                            <w:rFonts w:ascii="Calibri" w:hAnsi="Calibri" w:cs="Calibri"/>
+                            <w:sz w:val="20"/>
+                          </w:rPr>
+                          <w:t>3. MongoDB ObjectId (e.g. 507f1f77bcf86cd799439011)</w:t>
+                        </w:r>
+                      </w:p>
+                      <w:p>
+                        <w:pPr>
+                          <w:rPr>
+                            <w:rFonts w:ascii="Calibri" w:hAnsi="Calibri" w:cs="Calibri"/>
+                            <w:sz w:val="20"/>
+                          </w:rPr>
+                        </w:pPr>
+                      </w:p>
+                      <w:p>
+                        <w:pPr>
+                          <w:rPr>
+                            <w:rFonts w:ascii="Calibri" w:hAnsi="Calibri" w:cs="Calibri"/>
+                            <w:b/>
+                            <w:sz w:val="20"/>
+                          </w:rPr>
+                        </w:pPr>
+                        <w:r>
+                          <w:rPr>
+                            <w:rFonts w:ascii="Calibri" w:hAnsi="Calibri" w:cs="Calibri"/>
+                            <w:b/>
+                            <w:sz w:val="20"/>
+                          </w:rPr>
+                          <w:t>Phone Number Format</w:t>
+                        </w:r>
+                      </w:p>
+                      <w:p>
+                        <w:pPr>
+                          <w:rPr>
+                            <w:rFonts w:ascii="Calibri" w:hAnsi="Calibri" w:cs="Calibri"/>
+                            <w:sz w:val="20"/>
+                          </w:rPr>
+                        </w:pPr>
+                        <w:r>
+                          <w:rPr>
+                            <w:rFonts w:ascii="Calibri" w:hAnsi="Calibri" w:cs="Calibri"/>
+                            <w:sz w:val="20"/>
+                          </w:rPr>
+                          <w:t>Send exactly 10-digit mobile numbers (e.g. 9876543210)</w:t>
+                        </w:r>
+                      </w:p>
+                      <w:p>
+                        <w:pPr>
+                          <w:rPr>
+                            <w:rFonts w:ascii="Calibri" w:hAnsi="Calibri" w:cs="Calibri"/>
+                            <w:sz w:val="20"/>
+                          </w:rPr>
+                        </w:pPr>
+                        <w:r>
+                          <w:rPr>
+                            <w:rFonts w:ascii="Calibri" w:hAnsi="Calibri" w:cs="Calibri"/>
+                            <w:sz w:val="20"/>
+                          </w:rPr>
+                          <w:t>The system normalizes to 12-digit with country code (e.g. 919876543210)</w:t>
+                        </w:r>
+                      </w:p>
+                      <w:p>
+                        <w:pPr>
+                          <w:rPr>
+                            <w:rFonts w:ascii="Calibri" w:hAnsi="Calibri" w:cs="Calibri"/>
+                            <w:sz w:val="20"/>
+                          </w:rPr>
+                        </w:pPr>
+                      </w:p>
+                      <w:p>
+                        <w:pPr>
+                          <w:rPr>
+                            <w:rFonts w:ascii="Calibri" w:hAnsi="Calibri" w:cs="Calibri"/>
+                            <w:b/>
+                            <w:sz w:val="20"/>
+                          </w:rPr>
+                        </w:pPr>
+                        <w:r>
+                          <w:rPr>
+                            <w:rFonts w:ascii="Calibri" w:hAnsi="Calibri" w:cs="Calibri"/>
+                            <w:b/>
+                            <w:sz w:val="20"/>
+                          </w:rPr>
+                          <w:t>Limits</w:t>
+                        </w:r>
+                      </w:p>
+                      <w:p>
+                        <w:pPr>
+                          <w:rPr>
+                            <w:rFonts w:ascii="Calibri" w:hAnsi="Calibri" w:cs="Calibri"/>
+                            <w:sz w:val="20"/>
+                          </w:rPr>
+                        </w:pPr>
+                        <w:r>
+                          <w:rPr>
+                            <w:rFonts w:ascii="Calibri" w:hAnsi="Calibri" w:cs="Calibri"/>
+                            <w:sz w:val="20"/>
+                          </w:rPr>
+                          <w:t>Maximum 200 holders per request. For more than 200 volunteers, split into multiple requests.</w:t>
+                        </w:r>
+                      </w:p>
+                      <w:p>
+                        <w:pPr>
+                          <w:rPr>
+                            <w:rFonts w:ascii="Calibri" w:hAnsi="Calibri" w:cs="Calibri"/>
+                            <w:sz w:val="20"/>
+                          </w:rPr>
+                        </w:pPr>
+                      </w:p>
+                      <w:p>
+                        <w:pPr>
+                          <w:rPr>
+                            <w:rFonts w:ascii="Calibri" w:hAnsi="Calibri" w:cs="Calibri"/>
+                            <w:b/>
+                            <w:sz w:val="20"/>
+                          </w:rPr>
+                        </w:pPr>
+                        <w:r>
+                          <w:rPr>
+                            <w:rFonts w:ascii="Calibri" w:hAnsi="Calibri" w:cs="Calibri"/>
+                            <w:b/>
+                            <w:sz w:val="20"/>
+                          </w:rPr>
+                          <w:t>Error Responses</w:t>
+                        </w:r>
+                      </w:p>
+                      <w:p>
+                        <w:pPr>
+                          <w:rPr>
+                            <w:rFonts w:ascii="Calibri" w:hAnsi="Calibri" w:cs="Calibri"/>
+                            <w:sz w:val="20"/>
+                          </w:rPr>
+                        </w:pPr>
+                        <w:r>
+                          <w:rPr>
+                            <w:rFonts w:ascii="Calibri" w:hAnsi="Calibri" w:cs="Calibri"/>
+                            <w:sz w:val="20"/>
+                          </w:rPr>
+                          <w:t>All endpoints validate incoming data before processing. If validation fails:</w:t>
+                        </w:r>
+                      </w:p>
+                      <w:p>
+                        <w:pPr>
+                          <w:rPr>
+                            <w:rFonts w:ascii="Calibri" w:hAnsi="Calibri" w:cs="Calibri"/>
+                            <w:sz w:val="20"/>
+                          </w:rPr>
+                        </w:pPr>
+                      </w:p>
+                      <w:p>
+                        <w:pPr>
+                          <w:rPr>
+                            <w:rFonts w:ascii="Calibri" w:hAnsi="Calibri" w:cs="Calibri"/>
+                            <w:b/>
+                            <w:sz w:val="20"/>
+                          </w:rPr>
+                        </w:pPr>
+                        <w:r>
+                          <w:rPr>
+                            <w:rFonts w:ascii="Calibri" w:hAnsi="Calibri" w:cs="Calibri"/>
+                            <w:b/>
+                            <w:sz w:val="20"/>
+                          </w:rPr>
+                          <w:t>HTTP 400 Bad Request</w:t>
                         </w:r>
                       </w:p>
                       <w:p>
                         <w:pPr>
                           <w:rPr>
                             <w:rFonts w:ascii="Consolas" w:hAnsi="Consolas" w:cs="Calibri"/>
-                            <w:sz w:val="20"/>
+                            <w:sz w:val="18"/>
                           </w:rPr>
                         </w:pPr>
                         <w:r>
                           <w:rPr>
                             <w:rFonts w:ascii="Consolas" w:hAnsi="Consolas" w:cs="Calibri"/>
-                            <w:sz w:val="20"/>
-                          </w:rPr>
-                          <w:t>GET /api/integration/qr/:qrId</w:t>
+                            <w:sz w:val="18"/>
+                          </w:rPr>
+                          <w:t>{ "status": false, "message": "event_id is required" }</w:t>
                         </w:r>
                       </w:p>
                       <w:p>
@@ -1428,46 +1781,31 @@
                           <w:rPr>
                             <w:rFonts w:ascii="Calibri" w:hAnsi="Calibri" w:cs="Calibri"/>
                             <w:b/>
-                            <w:sz w:val="28"/>
+                            <w:sz w:val="20"/>
                           </w:rPr>
                         </w:pPr>
                         <w:r>
                           <w:rPr>
                             <w:rFonts w:ascii="Calibri" w:hAnsi="Calibri" w:cs="Calibri"/>
                             <w:b/>
-                            <w:sz w:val="28"/>
-                          </w:rPr>
-                          <w:t>4. Health Check</w:t>
-                        </w:r>
-                      </w:p>
-                      <w:p>
-                        <w:pPr>
-                          <w:rPr>
-                            <w:rFonts w:ascii="Calibri" w:hAnsi="Calibri" w:cs="Calibri"/>
-                            <w:sz w:val="20"/>
-                          </w:rPr>
-                        </w:pPr>
-                        <w:r>
-                          <w:rPr>
-                            <w:rFonts w:ascii="Calibri" w:hAnsi="Calibri" w:cs="Calibri"/>
-                            <w:sz w:val="20"/>
-                          </w:rPr>
-                          <w:t>Verify the API is reachable (no auth required).</w:t>
+                            <w:sz w:val="20"/>
+                          </w:rPr>
+                          <w:t>HTTP 400 Bad Request</w:t>
                         </w:r>
                       </w:p>
                       <w:p>
                         <w:pPr>
                           <w:rPr>
                             <w:rFonts w:ascii="Consolas" w:hAnsi="Consolas" w:cs="Calibri"/>
-                            <w:sz w:val="20"/>
+                            <w:sz w:val="18"/>
                           </w:rPr>
                         </w:pPr>
                         <w:r>
                           <w:rPr>
                             <w:rFonts w:ascii="Consolas" w:hAnsi="Consolas" w:cs="Calibri"/>
-                            <w:sz w:val="20"/>
-                          </w:rPr>
-                          <w:t>GET /api/integration/status</w:t>
+                            <w:sz w:val="18"/>
+                          </w:rPr>
+                          <w:t>{ "status": false, "message": "holders must be a non-empty array" }</w:t>
                         </w:r>
                       </w:p>
                       <w:p>
@@ -1483,47 +1821,40 @@
                           <w:rPr>
                             <w:rFonts w:ascii="Calibri" w:hAnsi="Calibri" w:cs="Calibri"/>
                             <w:b/>
-                            <w:sz w:val="28"/>
+                            <w:sz w:val="20"/>
                           </w:rPr>
                         </w:pPr>
                         <w:r>
                           <w:rPr>
                             <w:rFonts w:ascii="Calibri" w:hAnsi="Calibri" w:cs="Calibri"/>
                             <w:b/>
-                            <w:sz w:val="28"/>
-                          </w:rPr>
-                          <w:t>5. List Events</w:t>
-                        </w:r>
-                      </w:p>
-                      <w:p>
-                        <w:pPr>
-                          <w:rPr>
-                            <w:rFonts w:ascii="Calibri" w:hAnsi="Calibri" w:cs="Calibri"/>
-                            <w:sz w:val="20"/>
-                          </w:rPr>
-                        </w:pPr>
-                        <w:r>
-                          <w:rPr>
-                            <w:rFonts w:ascii="Calibri" w:hAnsi="Calibri" w:cs="Calibri"/>
-                            <w:sz w:val="20"/>
-                          </w:rPr>
-                          <w:t>Get all events to sync into the mobile app.</w:t>
+                            <w:sz w:val="20"/>
+                          </w:rPr>
+                          <w:t>HTTP 404 Not Found</w:t>
                         </w:r>
                       </w:p>
                       <w:p>
                         <w:pPr>
                           <w:rPr>
                             <w:rFonts w:ascii="Consolas" w:hAnsi="Consolas" w:cs="Calibri"/>
-                            <w:sz w:val="20"/>
+                            <w:sz w:val="18"/>
                           </w:rPr>
                         </w:pPr>
                         <w:r>
                           <w:rPr>
                             <w:rFonts w:ascii="Consolas" w:hAnsi="Consolas" w:cs="Calibri"/>
-                            <w:sz w:val="20"/>
-                          </w:rPr>
-                          <w:t>GET /api/integration/events</w:t>
-                        </w:r>
+                            <w:sz w:val="18"/>
+                          </w:rPr>
+                          <w:t>{ "status": false, "message": "Event not found for event_id: INVALID_CODE" }</w:t>
+                        </w:r>
+                      </w:p>
+                      <w:p>
+                        <w:pPr>
+                          <w:rPr>
+                            <w:rFonts w:ascii="Calibri" w:hAnsi="Calibri" w:cs="Calibri"/>
+                            <w:sz w:val="20"/>
+                          </w:rPr>
+                        </w:pPr>
                       </w:p>
                       <w:p>
                         <w:pPr>
@@ -1538,453 +1869,76 @@
                           <w:rPr>
                             <w:rFonts w:ascii="Calibri" w:hAnsi="Calibri" w:cs="Calibri"/>
                             <w:b/>
-                            <w:sz w:val="28"/>
+                            <w:sz w:val="20"/>
                           </w:rPr>
                         </w:pPr>
                         <w:r>
                           <w:rPr>
                             <w:rFonts w:ascii="Calibri" w:hAnsi="Calibri" w:cs="Calibri"/>
                             <w:b/>
-                            <w:sz w:val="28"/>
-                          </w:rPr>
-                          <w:t>6. Get Event Categories (Pass Types)</w:t>
-                        </w:r>
-                      </w:p>
-                      <w:p>
-                        <w:pPr>
-                          <w:rPr>
-                            <w:rFonts w:ascii="Calibri" w:hAnsi="Calibri" w:cs="Calibri"/>
-                            <w:sz w:val="20"/>
-                          </w:rPr>
-                        </w:pPr>
-                        <w:r>
-                          <w:rPr>
-                            <w:rFonts w:ascii="Calibri" w:hAnsi="Calibri" w:cs="Calibri"/>
-                            <w:sz w:val="20"/>
-                          </w:rPr>
-                          <w:t>Get available pass types for an event (for the category picker in the app).</w:t>
-                        </w:r>
-                      </w:p>
-                      <w:p>
-                        <w:pPr>
-                          <w:rPr>
-                            <w:rFonts w:ascii="Consolas" w:hAnsi="Consolas" w:cs="Calibri"/>
-                            <w:sz w:val="20"/>
-                          </w:rPr>
-                        </w:pPr>
-                        <w:r>
-                          <w:rPr>
-                            <w:rFonts w:ascii="Consolas" w:hAnsi="Consolas" w:cs="Calibri"/>
-                            <w:sz w:val="20"/>
-                          </w:rPr>
-                          <w:t>GET /api/integration/events/:eventCode/categories</w:t>
-                        </w:r>
-                      </w:p>
-                      <w:p>
-                        <w:pPr>
-                          <w:rPr>
-                            <w:rFonts w:ascii="Calibri" w:hAnsi="Calibri" w:cs="Calibri"/>
-                            <w:sz w:val="20"/>
-                          </w:rPr>
-                        </w:pPr>
-                      </w:p>
-                      <w:p>
-                        <w:pPr>
-                          <w:rPr>
-                            <w:rFonts w:ascii="Calibri" w:hAnsi="Calibri" w:cs="Calibri"/>
-                            <w:b/>
-                            <w:sz w:val="28"/>
-                          </w:rPr>
-                        </w:pPr>
-                        <w:r>
-                          <w:rPr>
-                            <w:rFonts w:ascii="Calibri" w:hAnsi="Calibri" w:cs="Calibri"/>
-                            <w:b/>
-                            <w:sz w:val="28"/>
-                          </w:rPr>
-                          <w:t>Important Notes</w:t>
-                        </w:r>
-                      </w:p>
-                      <w:p>
-                        <w:pPr>
-                          <w:rPr>
-                            <w:rFonts w:ascii="Calibri" w:hAnsi="Calibri" w:cs="Calibri"/>
-                            <w:b/>
-                            <w:sz w:val="20"/>
-                          </w:rPr>
-                        </w:pPr>
-                        <w:r>
-                          <w:rPr>
-                            <w:rFonts w:ascii="Calibri" w:hAnsi="Calibri" w:cs="Calibri"/>
-                            <w:b/>
-                            <w:sz w:val="20"/>
-                          </w:rPr>
-                          <w:t>Event ID Resolution</w:t>
-                        </w:r>
-                      </w:p>
-                      <w:p>
-                        <w:pPr>
-                          <w:rPr>
-                            <w:rFonts w:ascii="Calibri" w:hAnsi="Calibri" w:cs="Calibri"/>
-                            <w:sz w:val="20"/>
-                          </w:rPr>
-                        </w:pPr>
-                        <w:r>
-                          <w:rPr>
-                            <w:rFonts w:ascii="Calibri" w:hAnsi="Calibri" w:cs="Calibri"/>
-                            <w:sz w:val="20"/>
-                          </w:rPr>
-                          <w:t>The event_id field accepts any of these formats:</w:t>
-                        </w:r>
-                      </w:p>
-                      <w:p>
-                        <w:pPr>
-                          <w:rPr>
-                            <w:rFonts w:ascii="Calibri" w:hAnsi="Calibri" w:cs="Calibri"/>
-                            <w:sz w:val="20"/>
-                          </w:rPr>
-                        </w:pPr>
-                        <w:r>
-                          <w:rPr>
-                            <w:rFonts w:ascii="Calibri" w:hAnsi="Calibri" w:cs="Calibri"/>
-                            <w:sz w:val="20"/>
-                          </w:rPr>
-                          <w:t>- Event code (e.g. TST2) - case-insensitive</w:t>
-                        </w:r>
-                      </w:p>
-                      <w:p>
-                        <w:pPr>
-                          <w:rPr>
-                            <w:rFonts w:ascii="Calibri" w:hAnsi="Calibri" w:cs="Calibri"/>
-                            <w:sz w:val="20"/>
-                          </w:rPr>
-                        </w:pPr>
-                        <w:r>
-                          <w:rPr>
-                            <w:rFonts w:ascii="Calibri" w:hAnsi="Calibri" w:cs="Calibri"/>
-                            <w:sz w:val="20"/>
-                          </w:rPr>
-                          <w:t>- Third-party event ID (e.g. EVT1024) - if configured</w:t>
-                        </w:r>
-                      </w:p>
-                      <w:p>
-                        <w:pPr>
-                          <w:rPr>
-                            <w:rFonts w:ascii="Calibri" w:hAnsi="Calibri" w:cs="Calibri"/>
-                            <w:sz w:val="20"/>
-                          </w:rPr>
-                        </w:pPr>
-                        <w:r>
-                          <w:rPr>
-                            <w:rFonts w:ascii="Calibri" w:hAnsi="Calibri" w:cs="Calibri"/>
-                            <w:sz w:val="20"/>
-                          </w:rPr>
-                          <w:t>- MongoDB ObjectId (e.g. 507f1f77bcf86cd799439011)</w:t>
-                        </w:r>
-                      </w:p>
-                      <w:p>
-                        <w:pPr>
-                          <w:rPr>
-                            <w:rFonts w:ascii="Calibri" w:hAnsi="Calibri" w:cs="Calibri"/>
-                            <w:sz w:val="20"/>
-                          </w:rPr>
-                        </w:pPr>
-                      </w:p>
-                      <w:p>
-                        <w:pPr>
-                          <w:rPr>
-                            <w:rFonts w:ascii="Calibri" w:hAnsi="Calibri" w:cs="Calibri"/>
-                            <w:b/>
-                            <w:sz w:val="20"/>
-                          </w:rPr>
-                        </w:pPr>
-                        <w:r>
-                          <w:rPr>
-                            <w:rFonts w:ascii="Calibri" w:hAnsi="Calibri" w:cs="Calibri"/>
-                            <w:b/>
-                            <w:sz w:val="20"/>
-                          </w:rPr>
-                          <w:t>Phone Number Format</w:t>
-                        </w:r>
-                      </w:p>
-                      <w:p>
-                        <w:pPr>
-                          <w:rPr>
-                            <w:rFonts w:ascii="Calibri" w:hAnsi="Calibri" w:cs="Calibri"/>
-                            <w:sz w:val="20"/>
-                          </w:rPr>
-                        </w:pPr>
-                        <w:r>
-                          <w:rPr>
-                            <w:rFonts w:ascii="Calibri" w:hAnsi="Calibri" w:cs="Calibri"/>
-                            <w:sz w:val="20"/>
-                          </w:rPr>
-                          <w:t>- Send 10-digit numbers (e.g. 9876543210)</w:t>
-                        </w:r>
-                      </w:p>
-                      <w:p>
-                        <w:pPr>
-                          <w:rPr>
-                            <w:rFonts w:ascii="Calibri" w:hAnsi="Calibri" w:cs="Calibri"/>
-                            <w:sz w:val="20"/>
-                          </w:rPr>
-                        </w:pPr>
-                        <w:r>
-                          <w:rPr>
-                            <w:rFonts w:ascii="Calibri" w:hAnsi="Calibri" w:cs="Calibri"/>
-                            <w:sz w:val="20"/>
-                          </w:rPr>
-                          <w:t>- The system normalizes to 12-digit with country code (e.g. 919876543210)</w:t>
-                        </w:r>
-                      </w:p>
-                      <w:p>
-                        <w:pPr>
-                          <w:rPr>
-                            <w:rFonts w:ascii="Calibri" w:hAnsi="Calibri" w:cs="Calibri"/>
-                            <w:sz w:val="20"/>
-                          </w:rPr>
-                        </w:pPr>
-                      </w:p>
-                      <w:p>
-                        <w:pPr>
-                          <w:rPr>
-                            <w:rFonts w:ascii="Calibri" w:hAnsi="Calibri" w:cs="Calibri"/>
-                            <w:b/>
-                            <w:sz w:val="20"/>
-                          </w:rPr>
-                        </w:pPr>
-                        <w:r>
-                          <w:rPr>
-                            <w:rFonts w:ascii="Calibri" w:hAnsi="Calibri" w:cs="Calibri"/>
-                            <w:b/>
-                            <w:sz w:val="20"/>
-                          </w:rPr>
-                          <w:t>Duplicate Handling</w:t>
-                        </w:r>
-                      </w:p>
-                      <w:p>
-                        <w:pPr>
-                          <w:rPr>
-                            <w:rFonts w:ascii="Calibri" w:hAnsi="Calibri" w:cs="Calibri"/>
-                            <w:sz w:val="20"/>
-                          </w:rPr>
-                        </w:pPr>
-                        <w:r>
-                          <w:rPr>
-                            <w:rFonts w:ascii="Calibri" w:hAnsi="Calibri" w:cs="Calibri"/>
-                            <w:sz w:val="20"/>
-                          </w:rPr>
-                          <w:t>- If a holder already exists for that phone + event, the existing QR is returned</w:t>
-                        </w:r>
-                      </w:p>
-                      <w:p>
-                        <w:pPr>
-                          <w:rPr>
-                            <w:rFonts w:ascii="Calibri" w:hAnsi="Calibri" w:cs="Calibri"/>
-                            <w:sz w:val="20"/>
-                          </w:rPr>
-                        </w:pPr>
-                        <w:r>
-                          <w:rPr>
-                            <w:rFonts w:ascii="Calibri" w:hAnsi="Calibri" w:cs="Calibri"/>
-                            <w:sz w:val="20"/>
-                          </w:rPr>
-                          <w:t>- reused: true in the response indicates this</w:t>
-                        </w:r>
-                      </w:p>
-                      <w:p>
-                        <w:pPr>
-                          <w:rPr>
-                            <w:rFonts w:ascii="Calibri" w:hAnsi="Calibri" w:cs="Calibri"/>
-                            <w:sz w:val="20"/>
-                          </w:rPr>
-                        </w:pPr>
-                        <w:r>
-                          <w:rPr>
-                            <w:rFonts w:ascii="Calibri" w:hAnsi="Calibri" w:cs="Calibri"/>
-                            <w:sz w:val="20"/>
-                          </w:rPr>
-                          <w:t>- No duplicate QRs are created</w:t>
-                        </w:r>
-                      </w:p>
-                      <w:p>
-                        <w:pPr>
-                          <w:rPr>
-                            <w:rFonts w:ascii="Calibri" w:hAnsi="Calibri" w:cs="Calibri"/>
-                            <w:sz w:val="20"/>
-                          </w:rPr>
-                        </w:pPr>
-                      </w:p>
-                      <w:p>
-                        <w:pPr>
-                          <w:rPr>
-                            <w:rFonts w:ascii="Calibri" w:hAnsi="Calibri" w:cs="Calibri"/>
-                            <w:b/>
-                            <w:sz w:val="20"/>
-                          </w:rPr>
-                        </w:pPr>
-                        <w:r>
-                          <w:rPr>
-                            <w:rFonts w:ascii="Calibri" w:hAnsi="Calibri" w:cs="Calibri"/>
-                            <w:b/>
-                            <w:sz w:val="20"/>
-                          </w:rPr>
-                          <w:t>Auto-Creation</w:t>
-                        </w:r>
-                      </w:p>
-                      <w:p>
-                        <w:pPr>
-                          <w:rPr>
-                            <w:rFonts w:ascii="Calibri" w:hAnsi="Calibri" w:cs="Calibri"/>
-                            <w:sz w:val="20"/>
-                          </w:rPr>
-                        </w:pPr>
-                        <w:r>
-                          <w:rPr>
-                            <w:rFonts w:ascii="Calibri" w:hAnsi="Calibri" w:cs="Calibri"/>
-                            <w:sz w:val="20"/>
-                          </w:rPr>
-                          <w:t>- If the phone number doesn't exist as a holder for that event, a new holder is automatically created</w:t>
-                        </w:r>
-                      </w:p>
-                      <w:p>
-                        <w:pPr>
-                          <w:rPr>
-                            <w:rFonts w:ascii="Calibri" w:hAnsi="Calibri" w:cs="Calibri"/>
-                            <w:sz w:val="20"/>
-                          </w:rPr>
-                        </w:pPr>
-                        <w:r>
-                          <w:rPr>
-                            <w:rFonts w:ascii="Calibri" w:hAnsi="Calibri" w:cs="Calibri"/>
-                            <w:sz w:val="20"/>
-                          </w:rPr>
-                          <w:t>- Name defaults to Devotee &lt;last 4 digits of phone&gt; if not provided</w:t>
-                        </w:r>
-                      </w:p>
-                      <w:p>
-                        <w:pPr>
-                          <w:rPr>
-                            <w:rFonts w:ascii="Calibri" w:hAnsi="Calibri" w:cs="Calibri"/>
-                            <w:sz w:val="20"/>
-                          </w:rPr>
-                        </w:pPr>
-                      </w:p>
-                      <w:p>
-                        <w:pPr>
-                          <w:rPr>
-                            <w:rFonts w:ascii="Calibri" w:hAnsi="Calibri" w:cs="Calibri"/>
-                            <w:b/>
-                            <w:sz w:val="20"/>
-                          </w:rPr>
-                        </w:pPr>
-                        <w:r>
-                          <w:rPr>
-                            <w:rFonts w:ascii="Calibri" w:hAnsi="Calibri" w:cs="Calibri"/>
-                            <w:b/>
-                            <w:sz w:val="20"/>
-                          </w:rPr>
-                          <w:t>QR ID Format</w:t>
-                        </w:r>
-                      </w:p>
-                      <w:p>
-                        <w:pPr>
-                          <w:rPr>
-                            <w:rFonts w:ascii="Calibri" w:hAnsi="Calibri" w:cs="Calibri"/>
-                            <w:sz w:val="20"/>
-                          </w:rPr>
-                        </w:pPr>
-                        <w:r>
-                          <w:rPr>
-                            <w:rFonts w:ascii="Calibri" w:hAnsi="Calibri" w:cs="Calibri"/>
-                            <w:sz w:val="20"/>
-                          </w:rPr>
-                          <w:t>QR IDs follow the pattern: {eventCode}-{catCode}-{sequence}</w:t>
-                        </w:r>
-                      </w:p>
-                      <w:p>
-                        <w:pPr>
-                          <w:rPr>
-                            <w:rFonts w:ascii="Calibri" w:hAnsi="Calibri" w:cs="Calibri"/>
-                            <w:sz w:val="20"/>
-                          </w:rPr>
-                        </w:pPr>
-                        <w:r>
-                          <w:rPr>
-                            <w:rFonts w:ascii="Calibri" w:hAnsi="Calibri" w:cs="Calibri"/>
-                            <w:sz w:val="20"/>
-                          </w:rPr>
-                          <w:t>Example: TST2-INV-0001, TST2-SP-0042</w:t>
-                        </w:r>
-                      </w:p>
-                      <w:p>
-                        <w:pPr>
-                          <w:rPr>
-                            <w:rFonts w:ascii="Calibri" w:hAnsi="Calibri" w:cs="Calibri"/>
-                            <w:sz w:val="20"/>
-                          </w:rPr>
-                        </w:pPr>
-                      </w:p>
-                      <w:p>
-                        <w:pPr>
-                          <w:rPr>
-                            <w:rFonts w:ascii="Calibri" w:hAnsi="Calibri" w:cs="Calibri"/>
-                            <w:b/>
-                            <w:sz w:val="20"/>
-                          </w:rPr>
-                        </w:pPr>
-                        <w:r>
-                          <w:rPr>
-                            <w:rFonts w:ascii="Calibri" w:hAnsi="Calibri" w:cs="Calibri"/>
-                            <w:b/>
-                            <w:sz w:val="20"/>
-                          </w:rPr>
-                          <w:t>Limits</w:t>
-                        </w:r>
-                      </w:p>
-                      <w:p>
-                        <w:pPr>
-                          <w:rPr>
-                            <w:rFonts w:ascii="Calibri" w:hAnsi="Calibri" w:cs="Calibri"/>
-                            <w:sz w:val="20"/>
-                          </w:rPr>
-                        </w:pPr>
-                        <w:r>
-                          <w:rPr>
-                            <w:rFonts w:ascii="Calibri" w:hAnsi="Calibri" w:cs="Calibri"/>
-                            <w:sz w:val="20"/>
-                          </w:rPr>
-                          <w:t>- Single endpoint: 1 holder per call</w:t>
-                        </w:r>
-                      </w:p>
-                      <w:p>
-                        <w:pPr>
-                          <w:rPr>
-                            <w:rFonts w:ascii="Calibri" w:hAnsi="Calibri" w:cs="Calibri"/>
-                            <w:sz w:val="20"/>
-                          </w:rPr>
-                        </w:pPr>
-                        <w:r>
-                          <w:rPr>
-                            <w:rFonts w:ascii="Calibri" w:hAnsi="Calibri" w:cs="Calibri"/>
-                            <w:sz w:val="20"/>
-                          </w:rPr>
-                          <w:t>- Bulk endpoint: max 200 holders per call</w:t>
-                        </w:r>
-                      </w:p>
-                      <w:p>
-                        <w:pPr>
-                          <w:rPr>
-                            <w:rFonts w:ascii="Calibri" w:hAnsi="Calibri" w:cs="Calibri"/>
-                            <w:sz w:val="20"/>
-                          </w:rPr>
-                        </w:pPr>
-                        <w:r>
-                          <w:rPr>
-                            <w:rFonts w:ascii="Calibri" w:hAnsi="Calibri" w:cs="Calibri"/>
-                            <w:sz w:val="20"/>
-                          </w:rPr>
-                          <w:t>- For more than 200, split into multiple requests</w:t>
+                            <w:sz w:val="20"/>
+                          </w:rPr>
+                          <w:t>Common Validation Failure Reasons</w:t>
+                        </w:r>
+                      </w:p>
+                      <w:p>
+                        <w:pPr>
+                          <w:rPr>
+                            <w:rFonts w:ascii="Calibri" w:hAnsi="Calibri" w:cs="Calibri"/>
+                            <w:sz w:val="20"/>
+                          </w:rPr>
+                        </w:pPr>
+                        <w:r>
+                          <w:rPr>
+                            <w:rFonts w:ascii="Calibri" w:hAnsi="Calibri" w:cs="Calibri"/>
+                            <w:sz w:val="20"/>
+                          </w:rPr>
+                          <w:t>A required field (event_id or holders) is missing from the request body.</w:t>
+                        </w:r>
+                      </w:p>
+                      <w:p>
+                        <w:pPr>
+                          <w:rPr>
+                            <w:rFonts w:ascii="Calibri" w:hAnsi="Calibri" w:cs="Calibri"/>
+                            <w:sz w:val="20"/>
+                          </w:rPr>
+                        </w:pPr>
+                        <w:r>
+                          <w:rPr>
+                            <w:rFonts w:ascii="Calibri" w:hAnsi="Calibri" w:cs="Calibri"/>
+                            <w:sz w:val="20"/>
+                          </w:rPr>
+                          <w:t>The holders array is empty or exceeds 200 entries.</w:t>
+                        </w:r>
+                      </w:p>
+                      <w:p>
+                        <w:pPr>
+                          <w:rPr>
+                            <w:rFonts w:ascii="Calibri" w:hAnsi="Calibri" w:cs="Calibri"/>
+                            <w:sz w:val="20"/>
+                          </w:rPr>
+                        </w:pPr>
+                        <w:r>
+                          <w:rPr>
+                            <w:rFonts w:ascii="Calibri" w:hAnsi="Calibri" w:cs="Calibri"/>
+                            <w:sz w:val="20"/>
+                          </w:rPr>
+                          <w:t>event_id does not match any record in the system.</w:t>
+                        </w:r>
+                      </w:p>
+                      <w:p>
+                        <w:pPr>
+                          <w:rPr>
+                            <w:rFonts w:ascii="Calibri" w:hAnsi="Calibri" w:cs="Calibri"/>
+                            <w:sz w:val="20"/>
+                          </w:rPr>
+                        </w:pPr>
+                        <w:r>
+                          <w:rPr>
+                            <w:rFonts w:ascii="Calibri" w:hAnsi="Calibri" w:cs="Calibri"/>
+                            <w:sz w:val="20"/>
+                          </w:rPr>
+                          <w:t>A mobile number field is not exactly 10 digits.</w:t>
                         </w:r>
                       </w:p>
                       <w:p>
@@ -2000,6 +1954,26 @@
                             <w:sz w:val="20"/>
                           </w:rPr>
                           <w:t>ield</w:t>
+                        </w:r>
+                      </w:p>
+                    </w:tc>
+                    <w:tc>
+                      <w:tcPr>
+                        <w:tcW w:w="360" w:type="dxa"/>
+                      </w:tcPr>
+                      <w:p>
+                        <w:pPr>
+                          <w:rPr>
+                            <w:rFonts w:ascii="Calibri" w:hAnsi="Calibri" w:cs="Calibri"/>
+                            <w:sz w:val="20"/>
+                          </w:rPr>
+                        </w:pPr>
+                        <w:r>
+                          <w:rPr>
+                            <w:rFonts w:ascii="Calibri" w:hAnsi="Calibri" w:cs="Calibri"/>
+                            <w:sz w:val="20"/>
+                          </w:rPr>
+                          <w:t>Type</w:t>
                         </w:r>
                       </w:p>
                     </w:tc>
@@ -2047,7 +2021,7 @@
                             <w:rFonts w:ascii="Calibri" w:hAnsi="Calibri" w:cs="Calibri"/>
                             <w:sz w:val="20"/>
                           </w:rPr>
-                          <w:t>status</w:t>
+                          <w:t>results[].success</w:t>
                         </w:r>
                       </w:p>
                     </w:tc>
@@ -2067,7 +2041,27 @@
                             <w:rFonts w:ascii="Calibri" w:hAnsi="Calibri" w:cs="Calibri"/>
                             <w:sz w:val="20"/>
                           </w:rPr>
-                          <w:t>true if request was processed (check individual results for failures)</w:t>
+                          <w:t>boolean</w:t>
+                        </w:r>
+                      </w:p>
+                    </w:tc>
+                    <w:tc>
+                      <w:tcPr>
+                        <w:tcW w:w="360" w:type="dxa"/>
+                      </w:tcPr>
+                      <w:p>
+                        <w:pPr>
+                          <w:rPr>
+                            <w:rFonts w:ascii="Calibri" w:hAnsi="Calibri" w:cs="Calibri"/>
+                            <w:sz w:val="20"/>
+                          </w:rPr>
+                        </w:pPr>
+                        <w:r>
+                          <w:rPr>
+                            <w:rFonts w:ascii="Calibri" w:hAnsi="Calibri" w:cs="Calibri"/>
+                            <w:sz w:val="20"/>
+                          </w:rPr>
+                          <w:t>Whether this holder's QR pass was generated successfully.</w:t>
                         </w:r>
                       </w:p>
                     </w:tc>
@@ -2095,7 +2089,7 @@
                             <w:rFonts w:ascii="Calibri" w:hAnsi="Calibri" w:cs="Calibri"/>
                             <w:sz w:val="20"/>
                           </w:rPr>
-                          <w:t>total</w:t>
+                          <w:t>results[].reused</w:t>
                         </w:r>
                       </w:p>
                     </w:tc>
@@ -2115,7 +2109,27 @@
                             <w:rFonts w:ascii="Calibri" w:hAnsi="Calibri" w:cs="Calibri"/>
                             <w:sz w:val="20"/>
                           </w:rPr>
-                          <w:t>Total number of holders processed</w:t>
+                          <w:t>boolean</w:t>
+                        </w:r>
+                      </w:p>
+                    </w:tc>
+                    <w:tc>
+                      <w:tcPr>
+                        <w:tcW w:w="360" w:type="dxa"/>
+                      </w:tcPr>
+                      <w:p>
+                        <w:pPr>
+                          <w:rPr>
+                            <w:rFonts w:ascii="Calibri" w:hAnsi="Calibri" w:cs="Calibri"/>
+                            <w:sz w:val="20"/>
+                          </w:rPr>
+                        </w:pPr>
+                        <w:r>
+                          <w:rPr>
+                            <w:rFonts w:ascii="Calibri" w:hAnsi="Calibri" w:cs="Calibri"/>
+                            <w:sz w:val="20"/>
+                          </w:rPr>
+                          <w:t>true if an existing QR pass was returned (holder already had one).</w:t>
                         </w:r>
                       </w:p>
                     </w:tc>
@@ -2143,7 +2157,7 @@
                             <w:rFonts w:ascii="Calibri" w:hAnsi="Calibri" w:cs="Calibri"/>
                             <w:sz w:val="20"/>
                           </w:rPr>
-                          <w:t>succeeded</w:t>
+                          <w:t>results[].qr_id</w:t>
                         </w:r>
                       </w:p>
                     </w:tc>
@@ -2163,7 +2177,27 @@
                             <w:rFonts w:ascii="Calibri" w:hAnsi="Calibri" w:cs="Calibri"/>
                             <w:sz w:val="20"/>
                           </w:rPr>
-                          <w:t>Number of successfully generated QRs</w:t>
+                          <w:t>string</w:t>
+                        </w:r>
+                      </w:p>
+                    </w:tc>
+                    <w:tc>
+                      <w:tcPr>
+                        <w:tcW w:w="360" w:type="dxa"/>
+                      </w:tcPr>
+                      <w:p>
+                        <w:pPr>
+                          <w:rPr>
+                            <w:rFonts w:ascii="Calibri" w:hAnsi="Calibri" w:cs="Calibri"/>
+                            <w:sz w:val="20"/>
+                          </w:rPr>
+                        </w:pPr>
+                        <w:r>
+                          <w:rPr>
+                            <w:rFonts w:ascii="Calibri" w:hAnsi="Calibri" w:cs="Calibri"/>
+                            <w:sz w:val="20"/>
+                          </w:rPr>
+                          <w:t>The QR pass identifier. Use this to render the QR code image.</w:t>
                         </w:r>
                       </w:p>
                     </w:tc>
@@ -2191,7 +2225,7 @@
                             <w:rFonts w:ascii="Calibri" w:hAnsi="Calibri" w:cs="Calibri"/>
                             <w:sz w:val="20"/>
                           </w:rPr>
-                          <w:t>failed</w:t>
+                          <w:t>results[].name</w:t>
                         </w:r>
                       </w:p>
                     </w:tc>
@@ -2211,7 +2245,27 @@
                             <w:rFonts w:ascii="Calibri" w:hAnsi="Calibri" w:cs="Calibri"/>
                             <w:sz w:val="20"/>
                           </w:rPr>
-                          <w:t>Number of failures</w:t>
+                          <w:t>string</w:t>
+                        </w:r>
+                      </w:p>
+                    </w:tc>
+                    <w:tc>
+                      <w:tcPr>
+                        <w:tcW w:w="360" w:type="dxa"/>
+                      </w:tcPr>
+                      <w:p>
+                        <w:pPr>
+                          <w:rPr>
+                            <w:rFonts w:ascii="Calibri" w:hAnsi="Calibri" w:cs="Calibri"/>
+                            <w:sz w:val="20"/>
+                          </w:rPr>
+                        </w:pPr>
+                        <w:r>
+                          <w:rPr>
+                            <w:rFonts w:ascii="Calibri" w:hAnsi="Calibri" w:cs="Calibri"/>
+                            <w:sz w:val="20"/>
+                          </w:rPr>
+                          <w:t>Name of the volunteer.</w:t>
                         </w:r>
                       </w:p>
                     </w:tc>
@@ -2239,7 +2293,7 @@
                             <w:rFonts w:ascii="Calibri" w:hAnsi="Calibri" w:cs="Calibri"/>
                             <w:sz w:val="20"/>
                           </w:rPr>
-                          <w:t>results[]</w:t>
+                          <w:t>results[].phone</w:t>
                         </w:r>
                       </w:p>
                     </w:tc>
@@ -2259,7 +2313,27 @@
                             <w:rFonts w:ascii="Calibri" w:hAnsi="Calibri" w:cs="Calibri"/>
                             <w:sz w:val="20"/>
                           </w:rPr>
-                          <w:t>Per-holder result array</w:t>
+                          <w:t>string</w:t>
+                        </w:r>
+                      </w:p>
+                    </w:tc>
+                    <w:tc>
+                      <w:tcPr>
+                        <w:tcW w:w="360" w:type="dxa"/>
+                      </w:tcPr>
+                      <w:p>
+                        <w:pPr>
+                          <w:rPr>
+                            <w:rFonts w:ascii="Calibri" w:hAnsi="Calibri" w:cs="Calibri"/>
+                            <w:sz w:val="20"/>
+                          </w:rPr>
+                        </w:pPr>
+                        <w:r>
+                          <w:rPr>
+                            <w:rFonts w:ascii="Calibri" w:hAnsi="Calibri" w:cs="Calibri"/>
+                            <w:sz w:val="20"/>
+                          </w:rPr>
+                          <w:t>Normalized phone (12-digit with country code).</w:t>
                         </w:r>
                       </w:p>
                     </w:tc>
@@ -2287,7 +2361,7 @@
                             <w:rFonts w:ascii="Calibri" w:hAnsi="Calibri" w:cs="Calibri"/>
                             <w:sz w:val="20"/>
                           </w:rPr>
-                          <w:t>results[].success</w:t>
+                          <w:t>results[].error</w:t>
                         </w:r>
                       </w:p>
                     </w:tc>
@@ -2307,35 +2381,7 @@
                             <w:rFonts w:ascii="Calibri" w:hAnsi="Calibri" w:cs="Calibri"/>
                             <w:sz w:val="20"/>
                           </w:rPr>
-                          <w:t>Whether this holder QR was generated</w:t>
-                        </w:r>
-                      </w:p>
-                    </w:tc>
-                  </w:tr>
-                  <w:tr>
-                    <w:tblPrEx>
-                      <w:tblCellMar>
-                        <w:top w:w="0" w:type="dxa"/>
-                        <w:bottom w:w="0" w:type="dxa"/>
-                      </w:tblCellMar>
-                    </w:tblPrEx>
-                    <w:tc>
-                      <w:tcPr>
-                        <w:tcW w:w="360" w:type="dxa"/>
-                      </w:tcPr>
-                      <w:p>
-                        <w:pPr>
-                          <w:rPr>
-                            <w:rFonts w:ascii="Calibri" w:hAnsi="Calibri" w:cs="Calibri"/>
-                            <w:sz w:val="20"/>
-                          </w:rPr>
-                        </w:pPr>
-                        <w:r>
-                          <w:rPr>
-                            <w:rFonts w:ascii="Calibri" w:hAnsi="Calibri" w:cs="Calibri"/>
-                            <w:sz w:val="20"/>
-                          </w:rPr>
-                          <w:t>results[].reused</w:t>
+                          <w:t>string</w:t>
                         </w:r>
                       </w:p>
                     </w:tc>
@@ -2355,103 +2401,7 @@
                             <w:rFonts w:ascii="Calibri" w:hAnsi="Calibri" w:cs="Calibri"/>
                             <w:sz w:val="20"/>
                           </w:rPr>
-                          <w:t>true if an existing QR was returned (holder already had one)</w:t>
-                        </w:r>
-                      </w:p>
-                    </w:tc>
-                  </w:tr>
-                  <w:tr>
-                    <w:tblPrEx>
-                      <w:tblCellMar>
-                        <w:top w:w="0" w:type="dxa"/>
-                        <w:bottom w:w="0" w:type="dxa"/>
-                      </w:tblCellMar>
-                    </w:tblPrEx>
-                    <w:tc>
-                      <w:tcPr>
-                        <w:tcW w:w="360" w:type="dxa"/>
-                      </w:tcPr>
-                      <w:p>
-                        <w:pPr>
-                          <w:rPr>
-                            <w:rFonts w:ascii="Calibri" w:hAnsi="Calibri" w:cs="Calibri"/>
-                            <w:sz w:val="20"/>
-                          </w:rPr>
-                        </w:pPr>
-                        <w:r>
-                          <w:rPr>
-                            <w:rFonts w:ascii="Calibri" w:hAnsi="Calibri" w:cs="Calibri"/>
-                            <w:sz w:val="20"/>
-                          </w:rPr>
-                          <w:t>results[].qr_id</w:t>
-                        </w:r>
-                      </w:p>
-                    </w:tc>
-                    <w:tc>
-                      <w:tcPr>
-                        <w:tcW w:w="360" w:type="dxa"/>
-                      </w:tcPr>
-                      <w:p>
-                        <w:pPr>
-                          <w:rPr>
-                            <w:rFonts w:ascii="Calibri" w:hAnsi="Calibri" w:cs="Calibri"/>
-                            <w:sz w:val="20"/>
-                          </w:rPr>
-                        </w:pPr>
-                        <w:r>
-                          <w:rPr>
-                            <w:rFonts w:ascii="Calibri" w:hAnsi="Calibri" w:cs="Calibri"/>
-                            <w:sz w:val="20"/>
-                          </w:rPr>
-                          <w:t>The QR ID string - use this to render the QR code image</w:t>
-                        </w:r>
-                      </w:p>
-                    </w:tc>
-                  </w:tr>
-                  <w:tr>
-                    <w:tblPrEx>
-                      <w:tblCellMar>
-                        <w:top w:w="0" w:type="dxa"/>
-                        <w:bottom w:w="0" w:type="dxa"/>
-                      </w:tblCellMar>
-                    </w:tblPrEx>
-                    <w:tc>
-                      <w:tcPr>
-                        <w:tcW w:w="360" w:type="dxa"/>
-                      </w:tcPr>
-                      <w:p>
-                        <w:pPr>
-                          <w:rPr>
-                            <w:rFonts w:ascii="Calibri" w:hAnsi="Calibri" w:cs="Calibri"/>
-                            <w:sz w:val="20"/>
-                          </w:rPr>
-                        </w:pPr>
-                        <w:r>
-                          <w:rPr>
-                            <w:rFonts w:ascii="Calibri" w:hAnsi="Calibri" w:cs="Calibri"/>
-                            <w:sz w:val="20"/>
-                          </w:rPr>
-                          <w:t>results[].error</w:t>
-                        </w:r>
-                      </w:p>
-                    </w:tc>
-                    <w:tc>
-                      <w:tcPr>
-                        <w:tcW w:w="360" w:type="dxa"/>
-                      </w:tcPr>
-                      <w:p>
-                        <w:pPr>
-                          <w:rPr>
-                            <w:rFonts w:ascii="Calibri" w:hAnsi="Calibri" w:cs="Calibri"/>
-                            <w:sz w:val="20"/>
-                          </w:rPr>
-                        </w:pPr>
-                        <w:r>
-                          <w:rPr>
-                            <w:rFonts w:ascii="Calibri" w:hAnsi="Calibri" w:cs="Calibri"/>
-                            <w:sz w:val="20"/>
-                          </w:rPr>
-                          <w:t>Error message (only when success: false)</w:t>
+                          <w:t>Error description. Only present when success is false.</w:t>
                         </w:r>
                       </w:p>
                     </w:tc>
@@ -2475,7 +2425,7 @@
               </w:tc>
               <w:tc>
                 <w:tcPr>
-                  <w:tcW w:w="510" w:type="dxa"/>
+                  <w:tcW w:w="698" w:type="dxa"/>
                 </w:tcPr>
                 <w:p>
                   <w:pPr>
@@ -2495,7 +2445,7 @@
               </w:tc>
               <w:tc>
                 <w:tcPr>
-                  <w:tcW w:w="510" w:type="dxa"/>
+                  <w:tcW w:w="698" w:type="dxa"/>
                 </w:tcPr>
                 <w:p>
                   <w:pPr>
@@ -2515,7 +2465,7 @@
               </w:tc>
               <w:tc>
                 <w:tcPr>
-                  <w:tcW w:w="510" w:type="dxa"/>
+                  <w:tcW w:w="698" w:type="dxa"/>
                 </w:tcPr>
                 <w:p>
                   <w:pPr>
@@ -2543,7 +2493,7 @@
               </w:tblPrEx>
               <w:tc>
                 <w:tcPr>
-                  <w:tcW w:w="510" w:type="dxa"/>
+                  <w:tcW w:w="698" w:type="dxa"/>
                 </w:tcPr>
                 <w:p>
                   <w:pPr>
@@ -2563,7 +2513,7 @@
               </w:tc>
               <w:tc>
                 <w:tcPr>
-                  <w:tcW w:w="510" w:type="dxa"/>
+                  <w:tcW w:w="698" w:type="dxa"/>
                 </w:tcPr>
                 <w:p>
                   <w:pPr>
@@ -2583,7 +2533,7 @@
               </w:tc>
               <w:tc>
                 <w:tcPr>
-                  <w:tcW w:w="510" w:type="dxa"/>
+                  <w:tcW w:w="698" w:type="dxa"/>
                 </w:tcPr>
                 <w:p>
                   <w:pPr>
@@ -2603,7 +2553,7 @@
               </w:tc>
               <w:tc>
                 <w:tcPr>
-                  <w:tcW w:w="510" w:type="dxa"/>
+                  <w:tcW w:w="698" w:type="dxa"/>
                 </w:tcPr>
                 <w:p>
                   <w:pPr>
@@ -2617,7 +2567,7 @@
                       <w:rFonts w:ascii="Calibri" w:hAnsi="Calibri" w:cs="Calibri"/>
                       <w:sz w:val="20"/>
                     </w:rPr>
-                    <w:t>Event ID (eventCode, thirdPartyEventId, or MongoDB _id)</w:t>
+                    <w:t>Event ID. Matches by event code, third-party event ID, or MongoDB ObjectId.</w:t>
                   </w:r>
                 </w:p>
               </w:tc>
@@ -2631,7 +2581,7 @@
               </w:tblPrEx>
               <w:tc>
                 <w:tcPr>
-                  <w:tcW w:w="510" w:type="dxa"/>
+                  <w:tcW w:w="698" w:type="dxa"/>
                 </w:tcPr>
                 <w:p>
                   <w:pPr>
@@ -2651,7 +2601,7 @@
               </w:tc>
               <w:tc>
                 <w:tcPr>
-                  <w:tcW w:w="510" w:type="dxa"/>
+                  <w:tcW w:w="698" w:type="dxa"/>
                 </w:tcPr>
                 <w:p>
                   <w:pPr>
@@ -2671,7 +2621,7 @@
               </w:tc>
               <w:tc>
                 <w:tcPr>
-                  <w:tcW w:w="510" w:type="dxa"/>
+                  <w:tcW w:w="698" w:type="dxa"/>
                 </w:tcPr>
                 <w:p>
                   <w:pPr>
@@ -2691,7 +2641,7 @@
               </w:tc>
               <w:tc>
                 <w:tcPr>
-                  <w:tcW w:w="510" w:type="dxa"/>
+                  <w:tcW w:w="698" w:type="dxa"/>
                 </w:tcPr>
                 <w:p>
                   <w:pPr>
@@ -2705,7 +2655,7 @@
                       <w:rFonts w:ascii="Calibri" w:hAnsi="Calibri" w:cs="Calibri"/>
                       <w:sz w:val="20"/>
                     </w:rPr>
-                    <w:t>Array of volunteer objects (max 200)</w:t>
+                    <w:t>Array of volunteer objects. Maximum 200 per request.</w:t>
                   </w:r>
                 </w:p>
               </w:tc>
@@ -2719,7 +2669,7 @@
               </w:tblPrEx>
               <w:tc>
                 <w:tcPr>
-                  <w:tcW w:w="510" w:type="dxa"/>
+                  <w:tcW w:w="698" w:type="dxa"/>
                 </w:tcPr>
                 <w:p>
                   <w:pPr>
@@ -2739,7 +2689,7 @@
               </w:tc>
               <w:tc>
                 <w:tcPr>
-                  <w:tcW w:w="510" w:type="dxa"/>
+                  <w:tcW w:w="698" w:type="dxa"/>
                 </w:tcPr>
                 <w:p>
                   <w:pPr>
@@ -2759,7 +2709,7 @@
               </w:tc>
               <w:tc>
                 <w:tcPr>
-                  <w:tcW w:w="510" w:type="dxa"/>
+                  <w:tcW w:w="698" w:type="dxa"/>
                 </w:tcPr>
                 <w:p>
                   <w:pPr>
@@ -2779,7 +2729,7 @@
               </w:tc>
               <w:tc>
                 <w:tcPr>
-                  <w:tcW w:w="510" w:type="dxa"/>
+                  <w:tcW w:w="698" w:type="dxa"/>
                 </w:tcPr>
                 <w:p>
                   <w:pPr>
@@ -2793,7 +2743,7 @@
                       <w:rFonts w:ascii="Calibri" w:hAnsi="Calibri" w:cs="Calibri"/>
                       <w:sz w:val="20"/>
                     </w:rPr>
-                    <w:t>10-digit mobile number</w:t>
+                    <w:t>Exactly 10 digits. Mobile number of the volunteer. New holder is created if not found.</w:t>
                   </w:r>
                 </w:p>
               </w:tc>
@@ -2807,7 +2757,7 @@
               </w:tblPrEx>
               <w:tc>
                 <w:tcPr>
-                  <w:tcW w:w="510" w:type="dxa"/>
+                  <w:tcW w:w="698" w:type="dxa"/>
                 </w:tcPr>
                 <w:p>
                   <w:pPr>
@@ -2827,7 +2777,7 @@
               </w:tc>
               <w:tc>
                 <w:tcPr>
-                  <w:tcW w:w="510" w:type="dxa"/>
+                  <w:tcW w:w="698" w:type="dxa"/>
                 </w:tcPr>
                 <w:p>
                   <w:pPr>
@@ -2847,7 +2797,7 @@
               </w:tc>
               <w:tc>
                 <w:tcPr>
-                  <w:tcW w:w="510" w:type="dxa"/>
+                  <w:tcW w:w="698" w:type="dxa"/>
                 </w:tcPr>
                 <w:p>
                   <w:pPr>
@@ -2867,7 +2817,7 @@
               </w:tc>
               <w:tc>
                 <w:tcPr>
-                  <w:tcW w:w="510" w:type="dxa"/>
+                  <w:tcW w:w="698" w:type="dxa"/>
                 </w:tcPr>
                 <w:p>
                   <w:pPr>
@@ -2881,95 +2831,7 @@
                       <w:rFonts w:ascii="Calibri" w:hAnsi="Calibri" w:cs="Calibri"/>
                       <w:sz w:val="20"/>
                     </w:rPr>
-                    <w:t>Volunteer name (auto-generated if not provided)</w:t>
-                  </w:r>
-                </w:p>
-              </w:tc>
-            </w:tr>
-            <w:tr>
-              <w:tblPrEx>
-                <w:tblCellMar>
-                  <w:top w:w="0" w:type="dxa"/>
-                  <w:bottom w:w="0" w:type="dxa"/>
-                </w:tblCellMar>
-              </w:tblPrEx>
-              <w:tc>
-                <w:tcPr>
-                  <w:tcW w:w="510" w:type="dxa"/>
-                </w:tcPr>
-                <w:p>
-                  <w:pPr>
-                    <w:rPr>
-                      <w:rFonts w:ascii="Calibri" w:hAnsi="Calibri" w:cs="Calibri"/>
-                      <w:sz w:val="20"/>
-                    </w:rPr>
-                  </w:pPr>
-                  <w:r>
-                    <w:rPr>
-                      <w:rFonts w:ascii="Calibri" w:hAnsi="Calibri" w:cs="Calibri"/>
-                      <w:sz w:val="20"/>
-                    </w:rPr>
-                    <w:t>category</w:t>
-                  </w:r>
-                </w:p>
-              </w:tc>
-              <w:tc>
-                <w:tcPr>
-                  <w:tcW w:w="510" w:type="dxa"/>
-                </w:tcPr>
-                <w:p>
-                  <w:pPr>
-                    <w:rPr>
-                      <w:rFonts w:ascii="Calibri" w:hAnsi="Calibri" w:cs="Calibri"/>
-                      <w:sz w:val="20"/>
-                    </w:rPr>
-                  </w:pPr>
-                  <w:r>
-                    <w:rPr>
-                      <w:rFonts w:ascii="Calibri" w:hAnsi="Calibri" w:cs="Calibri"/>
-                      <w:sz w:val="20"/>
-                    </w:rPr>
-                    <w:t>string</w:t>
-                  </w:r>
-                </w:p>
-              </w:tc>
-              <w:tc>
-                <w:tcPr>
-                  <w:tcW w:w="510" w:type="dxa"/>
-                </w:tcPr>
-                <w:p>
-                  <w:pPr>
-                    <w:rPr>
-                      <w:rFonts w:ascii="Calibri" w:hAnsi="Calibri" w:cs="Calibri"/>
-                      <w:sz w:val="20"/>
-                    </w:rPr>
-                  </w:pPr>
-                  <w:r>
-                    <w:rPr>
-                      <w:rFonts w:ascii="Calibri" w:hAnsi="Calibri" w:cs="Calibri"/>
-                      <w:sz w:val="20"/>
-                    </w:rPr>
-                    <w:t>No</w:t>
-                  </w:r>
-                </w:p>
-              </w:tc>
-              <w:tc>
-                <w:tcPr>
-                  <w:tcW w:w="510" w:type="dxa"/>
-                </w:tcPr>
-                <w:p>
-                  <w:pPr>
-                    <w:rPr>
-                      <w:rFonts w:ascii="Calibri" w:hAnsi="Calibri" w:cs="Calibri"/>
-                      <w:sz w:val="20"/>
-                    </w:rPr>
-                  </w:pPr>
-                  <w:r>
-                    <w:rPr>
-                      <w:rFonts w:ascii="Calibri" w:hAnsi="Calibri" w:cs="Calibri"/>
-                      <w:sz w:val="20"/>
-                    </w:rPr>
-                    <w:t>Pass type code (INV, SP, DN). Defaults to Invitee</w:t>
+                    <w:t>Full name of the volunteer. Auto-generated if not provided.</w:t>
                   </w:r>
                 </w:p>
               </w:tc>
@@ -2993,7 +2855,7 @@
         </w:tc>
         <w:tc>
           <w:tcPr>
-            <w:tcW w:w="2256" w:type="dxa"/>
+            <w:tcW w:w="3009" w:type="dxa"/>
           </w:tcPr>
           <w:p>
             <w:pPr>
@@ -3013,27 +2875,7 @@
         </w:tc>
         <w:tc>
           <w:tcPr>
-            <w:tcW w:w="2257" w:type="dxa"/>
-          </w:tcPr>
-          <w:p>
-            <w:pPr>
-              <w:rPr>
-                <w:rFonts w:ascii="Calibri" w:hAnsi="Calibri" w:cs="Calibri"/>
-                <w:sz w:val="20"/>
-              </w:rPr>
-            </w:pPr>
-            <w:r>
-              <w:rPr>
-                <w:rFonts w:ascii="Calibri" w:hAnsi="Calibri" w:cs="Calibri"/>
-                <w:sz w:val="20"/>
-              </w:rPr>
-              <w:t>Required</w:t>
-            </w:r>
-          </w:p>
-        </w:tc>
-        <w:tc>
-          <w:tcPr>
-            <w:tcW w:w="2257" w:type="dxa"/>
+            <w:tcW w:w="3009" w:type="dxa"/>
           </w:tcPr>
           <w:p>
             <w:pPr>
@@ -3061,7 +2903,7 @@
         </w:tblPrEx>
         <w:tc>
           <w:tcPr>
-            <w:tcW w:w="2256" w:type="dxa"/>
+            <w:tcW w:w="3008" w:type="dxa"/>
           </w:tcPr>
           <w:p>
             <w:pPr>
@@ -3075,13 +2917,13 @@
                 <w:rFonts w:ascii="Calibri" w:hAnsi="Calibri" w:cs="Calibri"/>
                 <w:sz w:val="20"/>
               </w:rPr>
-              <w:t>event_id</w:t>
+              <w:t>status</w:t>
             </w:r>
           </w:p>
         </w:tc>
         <w:tc>
           <w:tcPr>
-            <w:tcW w:w="2256" w:type="dxa"/>
+            <w:tcW w:w="3009" w:type="dxa"/>
           </w:tcPr>
           <w:p>
             <w:pPr>
@@ -3095,13 +2937,13 @@
                 <w:rFonts w:ascii="Calibri" w:hAnsi="Calibri" w:cs="Calibri"/>
                 <w:sz w:val="20"/>
               </w:rPr>
-              <w:t>string</w:t>
+              <w:t>boolean</w:t>
             </w:r>
           </w:p>
         </w:tc>
         <w:tc>
           <w:tcPr>
-            <w:tcW w:w="2257" w:type="dxa"/>
+            <w:tcW w:w="3009" w:type="dxa"/>
           </w:tcPr>
           <w:p>
             <w:pPr>
@@ -3115,27 +2957,7 @@
                 <w:rFonts w:ascii="Calibri" w:hAnsi="Calibri" w:cs="Calibri"/>
                 <w:sz w:val="20"/>
               </w:rPr>
-              <w:t>Yes</w:t>
-            </w:r>
-          </w:p>
-        </w:tc>
-        <w:tc>
-          <w:tcPr>
-            <w:tcW w:w="2257" w:type="dxa"/>
-          </w:tcPr>
-          <w:p>
-            <w:pPr>
-              <w:rPr>
-                <w:rFonts w:ascii="Calibri" w:hAnsi="Calibri" w:cs="Calibri"/>
-                <w:sz w:val="20"/>
-              </w:rPr>
-            </w:pPr>
-            <w:r>
-              <w:rPr>
-                <w:rFonts w:ascii="Calibri" w:hAnsi="Calibri" w:cs="Calibri"/>
-                <w:sz w:val="20"/>
-              </w:rPr>
-              <w:t>Event ID (eventCode, thirdPartyEventId, or MongoDB _id)</w:t>
+              <w:t>true if the request was processed successfully.</w:t>
             </w:r>
           </w:p>
         </w:tc>
@@ -3149,7 +2971,7 @@
         </w:tblPrEx>
         <w:tc>
           <w:tcPr>
-            <w:tcW w:w="2256" w:type="dxa"/>
+            <w:tcW w:w="3008" w:type="dxa"/>
           </w:tcPr>
           <w:p>
             <w:pPr>
@@ -3163,13 +2985,13 @@
                 <w:rFonts w:ascii="Calibri" w:hAnsi="Calibri" w:cs="Calibri"/>
                 <w:sz w:val="20"/>
               </w:rPr>
-              <w:t>user_phone_number</w:t>
+              <w:t>message</w:t>
             </w:r>
           </w:p>
         </w:tc>
         <w:tc>
           <w:tcPr>
-            <w:tcW w:w="2256" w:type="dxa"/>
+            <w:tcW w:w="3009" w:type="dxa"/>
           </w:tcPr>
           <w:p>
             <w:pPr>
@@ -3189,7 +3011,7 @@
         </w:tc>
         <w:tc>
           <w:tcPr>
-            <w:tcW w:w="2257" w:type="dxa"/>
+            <w:tcW w:w="3009" w:type="dxa"/>
           </w:tcPr>
           <w:p>
             <w:pPr>
@@ -3203,27 +3025,7 @@
                 <w:rFonts w:ascii="Calibri" w:hAnsi="Calibri" w:cs="Calibri"/>
                 <w:sz w:val="20"/>
               </w:rPr>
-              <w:t>Yes</w:t>
-            </w:r>
-          </w:p>
-        </w:tc>
-        <w:tc>
-          <w:tcPr>
-            <w:tcW w:w="2257" w:type="dxa"/>
-          </w:tcPr>
-          <w:p>
-            <w:pPr>
-              <w:rPr>
-                <w:rFonts w:ascii="Calibri" w:hAnsi="Calibri" w:cs="Calibri"/>
-                <w:sz w:val="20"/>
-              </w:rPr>
-            </w:pPr>
-            <w:r>
-              <w:rPr>
-                <w:rFonts w:ascii="Calibri" w:hAnsi="Calibri" w:cs="Calibri"/>
-                <w:sz w:val="20"/>
-              </w:rPr>
-              <w:t>10-digit mobile number</w:t>
+              <w:t>Human-readable description of the result.</w:t>
             </w:r>
           </w:p>
         </w:tc>
@@ -3237,7 +3039,7 @@
         </w:tblPrEx>
         <w:tc>
           <w:tcPr>
-            <w:tcW w:w="2256" w:type="dxa"/>
+            <w:tcW w:w="3008" w:type="dxa"/>
           </w:tcPr>
           <w:p>
             <w:pPr>
@@ -3251,13 +3053,13 @@
                 <w:rFonts w:ascii="Calibri" w:hAnsi="Calibri" w:cs="Calibri"/>
                 <w:sz w:val="20"/>
               </w:rPr>
-              <w:t>name</w:t>
+              <w:t>total</w:t>
             </w:r>
           </w:p>
         </w:tc>
         <w:tc>
           <w:tcPr>
-            <w:tcW w:w="2256" w:type="dxa"/>
+            <w:tcW w:w="3009" w:type="dxa"/>
           </w:tcPr>
           <w:p>
             <w:pPr>
@@ -3271,13 +3073,13 @@
                 <w:rFonts w:ascii="Calibri" w:hAnsi="Calibri" w:cs="Calibri"/>
                 <w:sz w:val="20"/>
               </w:rPr>
-              <w:t>string</w:t>
+              <w:t>number</w:t>
             </w:r>
           </w:p>
         </w:tc>
         <w:tc>
           <w:tcPr>
-            <w:tcW w:w="2257" w:type="dxa"/>
+            <w:tcW w:w="3009" w:type="dxa"/>
           </w:tcPr>
           <w:p>
             <w:pPr>
@@ -3291,27 +3093,7 @@
                 <w:rFonts w:ascii="Calibri" w:hAnsi="Calibri" w:cs="Calibri"/>
                 <w:sz w:val="20"/>
               </w:rPr>
-              <w:t>No</w:t>
-            </w:r>
-          </w:p>
-        </w:tc>
-        <w:tc>
-          <w:tcPr>
-            <w:tcW w:w="2257" w:type="dxa"/>
-          </w:tcPr>
-          <w:p>
-            <w:pPr>
-              <w:rPr>
-                <w:rFonts w:ascii="Calibri" w:hAnsi="Calibri" w:cs="Calibri"/>
-                <w:sz w:val="20"/>
-              </w:rPr>
-            </w:pPr>
-            <w:r>
-              <w:rPr>
-                <w:rFonts w:ascii="Calibri" w:hAnsi="Calibri" w:cs="Calibri"/>
-                <w:sz w:val="20"/>
-              </w:rPr>
-              <w:t>Volunteer name (auto-generated if not provided)</w:t>
+              <w:t>Total number of holders processed.</w:t>
             </w:r>
           </w:p>
         </w:tc>
@@ -3325,7 +3107,7 @@
         </w:tblPrEx>
         <w:tc>
           <w:tcPr>
-            <w:tcW w:w="2256" w:type="dxa"/>
+            <w:tcW w:w="3008" w:type="dxa"/>
           </w:tcPr>
           <w:p>
             <w:pPr>
@@ -3339,13 +3121,13 @@
                 <w:rFonts w:ascii="Calibri" w:hAnsi="Calibri" w:cs="Calibri"/>
                 <w:sz w:val="20"/>
               </w:rPr>
-              <w:t>user_email</w:t>
+              <w:t>succeeded</w:t>
             </w:r>
           </w:p>
         </w:tc>
         <w:tc>
           <w:tcPr>
-            <w:tcW w:w="2256" w:type="dxa"/>
+            <w:tcW w:w="3009" w:type="dxa"/>
           </w:tcPr>
           <w:p>
             <w:pPr>
@@ -3359,13 +3141,13 @@
                 <w:rFonts w:ascii="Calibri" w:hAnsi="Calibri" w:cs="Calibri"/>
                 <w:sz w:val="20"/>
               </w:rPr>
-              <w:t>string</w:t>
+              <w:t>number</w:t>
             </w:r>
           </w:p>
         </w:tc>
         <w:tc>
           <w:tcPr>
-            <w:tcW w:w="2257" w:type="dxa"/>
+            <w:tcW w:w="3009" w:type="dxa"/>
           </w:tcPr>
           <w:p>
             <w:pPr>
@@ -3379,27 +3161,7 @@
                 <w:rFonts w:ascii="Calibri" w:hAnsi="Calibri" w:cs="Calibri"/>
                 <w:sz w:val="20"/>
               </w:rPr>
-              <w:t>No</w:t>
-            </w:r>
-          </w:p>
-        </w:tc>
-        <w:tc>
-          <w:tcPr>
-            <w:tcW w:w="2257" w:type="dxa"/>
-          </w:tcPr>
-          <w:p>
-            <w:pPr>
-              <w:rPr>
-                <w:rFonts w:ascii="Calibri" w:hAnsi="Calibri" w:cs="Calibri"/>
-                <w:sz w:val="20"/>
-              </w:rPr>
-            </w:pPr>
-            <w:r>
-              <w:rPr>
-                <w:rFonts w:ascii="Calibri" w:hAnsi="Calibri" w:cs="Calibri"/>
-                <w:sz w:val="20"/>
-              </w:rPr>
-              <w:t>Email address</w:t>
+              <w:t>Number of QR passes successfully generated.</w:t>
             </w:r>
           </w:p>
         </w:tc>
@@ -3413,7 +3175,7 @@
         </w:tblPrEx>
         <w:tc>
           <w:tcPr>
-            <w:tcW w:w="2256" w:type="dxa"/>
+            <w:tcW w:w="3008" w:type="dxa"/>
           </w:tcPr>
           <w:p>
             <w:pPr>
@@ -3427,13 +3189,13 @@
                 <w:rFonts w:ascii="Calibri" w:hAnsi="Calibri" w:cs="Calibri"/>
                 <w:sz w:val="20"/>
               </w:rPr>
-              <w:t>category</w:t>
+              <w:t>failed</w:t>
             </w:r>
           </w:p>
         </w:tc>
         <w:tc>
           <w:tcPr>
-            <w:tcW w:w="2256" w:type="dxa"/>
+            <w:tcW w:w="3009" w:type="dxa"/>
           </w:tcPr>
           <w:p>
             <w:pPr>
@@ -3447,13 +3209,13 @@
                 <w:rFonts w:ascii="Calibri" w:hAnsi="Calibri" w:cs="Calibri"/>
                 <w:sz w:val="20"/>
               </w:rPr>
-              <w:t>string</w:t>
+              <w:t>number</w:t>
             </w:r>
           </w:p>
         </w:tc>
         <w:tc>
           <w:tcPr>
-            <w:tcW w:w="2257" w:type="dxa"/>
+            <w:tcW w:w="3009" w:type="dxa"/>
           </w:tcPr>
           <w:p>
             <w:pPr>
@@ -3467,27 +3229,7 @@
                 <w:rFonts w:ascii="Calibri" w:hAnsi="Calibri" w:cs="Calibri"/>
                 <w:sz w:val="20"/>
               </w:rPr>
-              <w:t>No</w:t>
-            </w:r>
-          </w:p>
-        </w:tc>
-        <w:tc>
-          <w:tcPr>
-            <w:tcW w:w="2257" w:type="dxa"/>
-          </w:tcPr>
-          <w:p>
-            <w:pPr>
-              <w:rPr>
-                <w:rFonts w:ascii="Calibri" w:hAnsi="Calibri" w:cs="Calibri"/>
-                <w:sz w:val="20"/>
-              </w:rPr>
-            </w:pPr>
-            <w:r>
-              <w:rPr>
-                <w:rFonts w:ascii="Calibri" w:hAnsi="Calibri" w:cs="Calibri"/>
-                <w:sz w:val="20"/>
-              </w:rPr>
-              <w:t>Pass type code (INV, SP, DN, VL). Defaults to Invitee</w:t>
+              <w:t>Number of failures.</w:t>
             </w:r>
           </w:p>
         </w:tc>
@@ -3501,7 +3243,7 @@
         </w:tblPrEx>
         <w:tc>
           <w:tcPr>
-            <w:tcW w:w="2256" w:type="dxa"/>
+            <w:tcW w:w="3008" w:type="dxa"/>
           </w:tcPr>
           <w:p>
             <w:pPr>
@@ -3515,13 +3257,13 @@
                 <w:rFonts w:ascii="Calibri" w:hAnsi="Calibri" w:cs="Calibri"/>
                 <w:sz w:val="20"/>
               </w:rPr>
-              <w:t>preacher</w:t>
+              <w:t>results</w:t>
             </w:r>
           </w:p>
         </w:tc>
         <w:tc>
           <w:tcPr>
-            <w:tcW w:w="2256" w:type="dxa"/>
+            <w:tcW w:w="3009" w:type="dxa"/>
           </w:tcPr>
           <w:p>
             <w:pPr>
@@ -3535,13 +3277,13 @@
                 <w:rFonts w:ascii="Calibri" w:hAnsi="Calibri" w:cs="Calibri"/>
                 <w:sz w:val="20"/>
               </w:rPr>
-              <w:t>string</w:t>
+              <w:t>array</w:t>
             </w:r>
           </w:p>
         </w:tc>
         <w:tc>
           <w:tcPr>
-            <w:tcW w:w="2257" w:type="dxa"/>
+            <w:tcW w:w="3009" w:type="dxa"/>
           </w:tcPr>
           <w:p>
             <w:pPr>
@@ -3555,27 +3297,7 @@
                 <w:rFonts w:ascii="Calibri" w:hAnsi="Calibri" w:cs="Calibri"/>
                 <w:sz w:val="20"/>
               </w:rPr>
-              <w:t>No</w:t>
-            </w:r>
-          </w:p>
-        </w:tc>
-        <w:tc>
-          <w:tcPr>
-            <w:tcW w:w="2257" w:type="dxa"/>
-          </w:tcPr>
-          <w:p>
-            <w:pPr>
-              <w:rPr>
-                <w:rFonts w:ascii="Calibri" w:hAnsi="Calibri" w:cs="Calibri"/>
-                <w:sz w:val="20"/>
-              </w:rPr>
-            </w:pPr>
-            <w:r>
-              <w:rPr>
-                <w:rFonts w:ascii="Calibri" w:hAnsi="Calibri" w:cs="Calibri"/>
-                <w:sz w:val="20"/>
-              </w:rPr>
-              <w:t>Preacher name or short code for attribution</w:t>
+              <w:t>Per-holder result array. See Response Fields below.</w:t>
             </w:r>
           </w:p>
         </w:tc>
@@ -4007,7 +3729,7 @@
     <w:link w:val="Heading1Char"/>
     <w:uiPriority w:val="9"/>
     <w:qFormat/>
-    <w:rsid w:val="001551CE"/>
+    <w:rsid w:val="006A642D"/>
     <w:pPr>
       <w:keepNext/>
       <w:keepLines/>
@@ -4030,7 +3752,7 @@
     <w:semiHidden/>
     <w:unhideWhenUsed/>
     <w:qFormat/>
-    <w:rsid w:val="001551CE"/>
+    <w:rsid w:val="006A642D"/>
     <w:pPr>
       <w:keepNext/>
       <w:keepLines/>
@@ -4053,7 +3775,7 @@
     <w:semiHidden/>
     <w:unhideWhenUsed/>
     <w:qFormat/>
-    <w:rsid w:val="001551CE"/>
+    <w:rsid w:val="006A642D"/>
     <w:pPr>
       <w:keepNext/>
       <w:keepLines/>
@@ -4076,7 +3798,7 @@
     <w:semiHidden/>
     <w:unhideWhenUsed/>
     <w:qFormat/>
-    <w:rsid w:val="001551CE"/>
+    <w:rsid w:val="006A642D"/>
     <w:pPr>
       <w:keepNext/>
       <w:keepLines/>
@@ -4099,7 +3821,7 @@
     <w:semiHidden/>
     <w:unhideWhenUsed/>
     <w:qFormat/>
-    <w:rsid w:val="001551CE"/>
+    <w:rsid w:val="006A642D"/>
     <w:pPr>
       <w:keepNext/>
       <w:keepLines/>
@@ -4120,7 +3842,7 @@
     <w:semiHidden/>
     <w:unhideWhenUsed/>
     <w:qFormat/>
-    <w:rsid w:val="001551CE"/>
+    <w:rsid w:val="006A642D"/>
     <w:pPr>
       <w:keepNext/>
       <w:keepLines/>
@@ -4143,7 +3865,7 @@
     <w:semiHidden/>
     <w:unhideWhenUsed/>
     <w:qFormat/>
-    <w:rsid w:val="001551CE"/>
+    <w:rsid w:val="006A642D"/>
     <w:pPr>
       <w:keepNext/>
       <w:keepLines/>
@@ -4164,7 +3886,7 @@
     <w:semiHidden/>
     <w:unhideWhenUsed/>
     <w:qFormat/>
-    <w:rsid w:val="001551CE"/>
+    <w:rsid w:val="006A642D"/>
     <w:pPr>
       <w:keepNext/>
       <w:keepLines/>
@@ -4187,7 +3909,7 @@
     <w:semiHidden/>
     <w:unhideWhenUsed/>
     <w:qFormat/>
-    <w:rsid w:val="001551CE"/>
+    <w:rsid w:val="006A642D"/>
     <w:pPr>
       <w:keepNext/>
       <w:keepLines/>
@@ -4231,7 +3953,7 @@
     <w:basedOn w:val="DefaultParagraphFont"/>
     <w:link w:val="Heading1"/>
     <w:uiPriority w:val="9"/>
-    <w:rsid w:val="001551CE"/>
+    <w:rsid w:val="006A642D"/>
     <w:rPr>
       <w:rFonts w:asciiTheme="majorHAnsi" w:eastAsiaTheme="majorEastAsia" w:hAnsiTheme="majorHAnsi" w:cstheme="majorBidi"/>
       <w:color w:val="2F5496" w:themeColor="accent1" w:themeShade="BF"/>
@@ -4245,7 +3967,7 @@
     <w:link w:val="Heading2"/>
     <w:uiPriority w:val="9"/>
     <w:semiHidden/>
-    <w:rsid w:val="001551CE"/>
+    <w:rsid w:val="006A642D"/>
     <w:rPr>
       <w:rFonts w:asciiTheme="majorHAnsi" w:eastAsiaTheme="majorEastAsia" w:hAnsiTheme="majorHAnsi" w:cstheme="majorBidi"/>
       <w:color w:val="2F5496" w:themeColor="accent1" w:themeShade="BF"/>
@@ -4259,7 +3981,7 @@
     <w:link w:val="Heading3"/>
     <w:uiPriority w:val="9"/>
     <w:semiHidden/>
-    <w:rsid w:val="001551CE"/>
+    <w:rsid w:val="006A642D"/>
     <w:rPr>
       <w:rFonts w:eastAsiaTheme="majorEastAsia" w:cstheme="majorBidi"/>
       <w:color w:val="2F5496" w:themeColor="accent1" w:themeShade="BF"/>
@@ -4273,7 +3995,7 @@
     <w:link w:val="Heading4"/>
     <w:uiPriority w:val="9"/>
     <w:semiHidden/>
-    <w:rsid w:val="001551CE"/>
+    <w:rsid w:val="006A642D"/>
     <w:rPr>
       <w:rFonts w:eastAsiaTheme="majorEastAsia" w:cstheme="majorBidi"/>
       <w:i/>
@@ -4287,7 +4009,7 @@
     <w:link w:val="Heading5"/>
     <w:uiPriority w:val="9"/>
     <w:semiHidden/>
-    <w:rsid w:val="001551CE"/>
+    <w:rsid w:val="006A642D"/>
     <w:rPr>
       <w:rFonts w:eastAsiaTheme="majorEastAsia" w:cstheme="majorBidi"/>
       <w:color w:val="2F5496" w:themeColor="accent1" w:themeShade="BF"/>
@@ -4299,7 +4021,7 @@
     <w:link w:val="Heading6"/>
     <w:uiPriority w:val="9"/>
     <w:semiHidden/>
-    <w:rsid w:val="001551CE"/>
+    <w:rsid w:val="006A642D"/>
     <w:rPr>
       <w:rFonts w:eastAsiaTheme="majorEastAsia" w:cstheme="majorBidi"/>
       <w:i/>
@@ -4313,7 +4035,7 @@
     <w:link w:val="Heading7"/>
     <w:uiPriority w:val="9"/>
     <w:semiHidden/>
-    <w:rsid w:val="001551CE"/>
+    <w:rsid w:val="006A642D"/>
     <w:rPr>
       <w:rFonts w:eastAsiaTheme="majorEastAsia" w:cstheme="majorBidi"/>
       <w:color w:val="595959" w:themeColor="text1" w:themeTint="A6"/>
@@ -4325,7 +4047,7 @@
     <w:link w:val="Heading8"/>
     <w:uiPriority w:val="9"/>
     <w:semiHidden/>
-    <w:rsid w:val="001551CE"/>
+    <w:rsid w:val="006A642D"/>
     <w:rPr>
       <w:rFonts w:eastAsiaTheme="majorEastAsia" w:cstheme="majorBidi"/>
       <w:i/>
@@ -4339,7 +4061,7 @@
     <w:link w:val="Heading9"/>
     <w:uiPriority w:val="9"/>
     <w:semiHidden/>
-    <w:rsid w:val="001551CE"/>
+    <w:rsid w:val="006A642D"/>
     <w:rPr>
       <w:rFonts w:eastAsiaTheme="majorEastAsia" w:cstheme="majorBidi"/>
       <w:color w:val="272727" w:themeColor="text1" w:themeTint="D8"/>
@@ -4352,7 +4074,7 @@
     <w:link w:val="TitleChar"/>
     <w:uiPriority w:val="10"/>
     <w:qFormat/>
-    <w:rsid w:val="001551CE"/>
+    <w:rsid w:val="006A642D"/>
     <w:pPr>
       <w:spacing w:after="80" w:line="240" w:lineRule="auto"/>
       <w:contextualSpacing/>
@@ -4370,7 +4092,7 @@
     <w:basedOn w:val="DefaultParagraphFont"/>
     <w:link w:val="Title"/>
     <w:uiPriority w:val="10"/>
-    <w:rsid w:val="001551CE"/>
+    <w:rsid w:val="006A642D"/>
     <w:rPr>
       <w:rFonts w:asciiTheme="majorHAnsi" w:eastAsiaTheme="majorEastAsia" w:hAnsiTheme="majorHAnsi" w:cstheme="majorBidi"/>
       <w:spacing w:val="-10"/>
@@ -4386,7 +4108,7 @@
     <w:link w:val="SubtitleChar"/>
     <w:uiPriority w:val="11"/>
     <w:qFormat/>
-    <w:rsid w:val="001551CE"/>
+    <w:rsid w:val="006A642D"/>
     <w:pPr>
       <w:numPr>
         <w:ilvl w:val="1"/>
@@ -4405,7 +4127,7 @@
     <w:basedOn w:val="DefaultParagraphFont"/>
     <w:link w:val="Subtitle"/>
     <w:uiPriority w:val="11"/>
-    <w:rsid w:val="001551CE"/>
+    <w:rsid w:val="006A642D"/>
     <w:rPr>
       <w:rFonts w:eastAsiaTheme="majorEastAsia" w:cstheme="majorBidi"/>
       <w:color w:val="595959" w:themeColor="text1" w:themeTint="A6"/>
@@ -4421,7 +4143,7 @@
     <w:link w:val="QuoteChar"/>
     <w:uiPriority w:val="29"/>
     <w:qFormat/>
-    <w:rsid w:val="001551CE"/>
+    <w:rsid w:val="006A642D"/>
     <w:pPr>
       <w:spacing w:before="160"/>
       <w:jc w:val="center"/>
@@ -4437,7 +4159,7 @@
     <w:basedOn w:val="DefaultParagraphFont"/>
     <w:link w:val="Quote"/>
     <w:uiPriority w:val="29"/>
-    <w:rsid w:val="001551CE"/>
+    <w:rsid w:val="006A642D"/>
     <w:rPr>
       <w:i/>
       <w:iCs/>
@@ -4449,7 +4171,7 @@
     <w:basedOn w:val="Normal"/>
     <w:uiPriority w:val="34"/>
     <w:qFormat/>
-    <w:rsid w:val="001551CE"/>
+    <w:rsid w:val="006A642D"/>
     <w:pPr>
       <w:ind w:left="720"/>
       <w:contextualSpacing/>
@@ -4460,7 +4182,7 @@
     <w:basedOn w:val="DefaultParagraphFont"/>
     <w:uiPriority w:val="21"/>
     <w:qFormat/>
-    <w:rsid w:val="001551CE"/>
+    <w:rsid w:val="006A642D"/>
     <w:rPr>
       <w:i/>
       <w:iCs/>
@@ -4474,7 +4196,7 @@
     <w:link w:val="IntenseQuoteChar"/>
     <w:uiPriority w:val="30"/>
     <w:qFormat/>
-    <w:rsid w:val="001551CE"/>
+    <w:rsid w:val="006A642D"/>
     <w:pPr>
       <w:pBdr>
         <w:top w:val="single" w:sz="4" w:space="10" w:color="2F5496" w:themeColor="accent1" w:themeShade="BF"/>
@@ -4495,7 +4217,7 @@
     <w:basedOn w:val="DefaultParagraphFont"/>
     <w:link w:val="IntenseQuote"/>
     <w:uiPriority w:val="30"/>
-    <w:rsid w:val="001551CE"/>
+    <w:rsid w:val="006A642D"/>
     <w:rPr>
       <w:i/>
       <w:iCs/>
@@ -4507,7 +4229,7 @@
     <w:basedOn w:val="DefaultParagraphFont"/>
     <w:uiPriority w:val="32"/>
     <w:qFormat/>
-    <w:rsid w:val="001551CE"/>
+    <w:rsid w:val="006A642D"/>
     <w:rPr>
       <w:b/>
       <w:bCs/>

</xml_diff>